<commit_message>
PROJET PRET A 87% DU CAHIER DE CHARGES
</commit_message>
<xml_diff>
--- a/rapport de stage academique.docx
+++ b/rapport de stage academique.docx
@@ -34912,6 +34912,8 @@
         </w:rPr>
         <w:t>: captures besoins agent immigration</w:t>
       </w:r>
+      <w:bookmarkStart w:id="0" w:name="_GoBack"/>
+      <w:bookmarkEnd w:id="0"/>
     </w:p>
     <w:tbl>
       <w:tblPr>
@@ -36800,6 +36802,10 @@
             <w:insideH w:val="none" w:color="auto" w:sz="0" w:space="0"/>
             <w:insideV w:val="none" w:color="auto" w:sz="0" w:space="0"/>
           </w:tblBorders>
+          <w:tblCellMar>
+            <w:left w:w="108" w:type="dxa"/>
+            <w:right w:w="108" w:type="dxa"/>
+          </w:tblCellMar>
         </w:tblPrEx>
         <w:tc>
           <w:tcPr>
@@ -37599,8 +37605,6 @@
         </w:rPr>
         <w:t>L’estimation de notre projet permet d’estimer son prix sur un marche de vente. A fin de proceder de maniere plausible. Nous scinderons les coûts suivant les équipements utilises et selon la main d’œuvre.</w:t>
       </w:r>
-      <w:bookmarkStart w:id="0" w:name="_GoBack"/>
-      <w:bookmarkEnd w:id="0"/>
     </w:p>
     <w:p>
       <w:pPr>
@@ -39147,10 +39151,6 @@
             <w:insideH w:val="single" w:color="auto" w:sz="4" w:space="0"/>
             <w:insideV w:val="single" w:color="auto" w:sz="4" w:space="0"/>
           </w:tblBorders>
-          <w:tblCellMar>
-            <w:left w:w="108" w:type="dxa"/>
-            <w:right w:w="108" w:type="dxa"/>
-          </w:tblCellMar>
         </w:tblPrEx>
         <w:trPr>
           <w:trHeight w:val="902" w:hRule="atLeast"/>
@@ -42403,6 +42403,10 @@
             <w:insideH w:val="single" w:color="auto" w:sz="4" w:space="0"/>
             <w:insideV w:val="single" w:color="auto" w:sz="4" w:space="0"/>
           </w:tblBorders>
+          <w:tblCellMar>
+            <w:left w:w="108" w:type="dxa"/>
+            <w:right w:w="108" w:type="dxa"/>
+          </w:tblCellMar>
         </w:tblPrEx>
         <w:tc>
           <w:tcPr>

</xml_diff>

<commit_message>
PROJET PRET A 92% DU CAHIER DE CHARGES
</commit_message>
<xml_diff>
--- a/rapport de stage academique.docx
+++ b/rapport de stage academique.docx
@@ -471,7 +471,7 @@
           <w:szCs w:val="24"/>
           <w:lang w:val="fr-FR"/>
         </w:rPr>
-        <w:t>, Directeur de l’ENSPD de Douala pour tous les moyens qui’il met en oeuvre pour notre reussite academique et notre insertion professionnelle;</w:t>
+        <w:t>, Directeur de l’ENSPD de Douala pour tous les moyens qu’il met en œuvre pour notre réussite académique et notre insertion professionnelle;</w:t>
       </w:r>
     </w:p>
     <w:p>
@@ -534,7 +534,7 @@
           <w:szCs w:val="24"/>
           <w:lang w:val="fr-FR"/>
         </w:rPr>
-        <w:t xml:space="preserve">Docteur MAKA MAKA Ebenezer </w:t>
+        <w:t xml:space="preserve">Dr. MAKA MAKA Ebenezer </w:t>
       </w:r>
       <w:r>
         <w:rPr>
@@ -1029,18 +1029,7 @@
           <w:szCs w:val="24"/>
           <w:lang w:val="fr-FR"/>
         </w:rPr>
-        <w:t>Gabrielle</w:t>
-      </w:r>
-      <w:r>
-        <w:rPr>
-          <w:rFonts w:hint="default" w:ascii="Times New Roman" w:hAnsi="Times New Roman" w:cs="Times New Roman"/>
-          <w:b/>
-          <w:bCs/>
-          <w:sz w:val="24"/>
-          <w:szCs w:val="24"/>
-          <w:lang w:val="fr-FR"/>
-        </w:rPr>
-        <w:t>, aubry, chelsea, julien, yaelle, jaelle, kathia , kassandra, Éden etc...</w:t>
+        <w:t>Gabrielle, aubry, chelsea, julien, yaelle, jaelle, kathia , kassandra, Éden etc...</w:t>
       </w:r>
       <w:r>
         <w:rPr>
@@ -19196,7 +19185,6 @@
           <w:lang w:val="fr-FR"/>
         </w:rPr>
         <w:tab/>
-        <w:t/>
       </w:r>
       <w:r>
         <w:rPr>
@@ -19206,6 +19194,14 @@
           <w:lang w:val="fr-FR"/>
         </w:rPr>
         <w:tab/>
+      </w:r>
+      <w:r>
+        <w:rPr>
+          <w:rFonts w:hint="default" w:ascii="Times New Roman" w:hAnsi="Times New Roman" w:cs="Times New Roman"/>
+          <w:sz w:val="24"/>
+          <w:szCs w:val="24"/>
+          <w:lang w:val="fr-FR"/>
+        </w:rPr>
         <w:t xml:space="preserve">Comme son nom l’indique, l’étude d’organisation s’attache </w:t>
       </w:r>
       <w:r>
@@ -19798,6 +19794,7 @@
     <w:p>
       <w:pPr>
         <w:numPr>
+          <w:ilvl w:val="0"/>
           <w:numId w:val="0"/>
         </w:numPr>
         <w:jc w:val="both"/>
@@ -30900,7 +30897,7 @@
           <w:szCs w:val="24"/>
           <w:lang w:val="fr-FR"/>
         </w:rPr>
-        <w:t>: captures besoin demandeurs visa</w:t>
+        <w:t>: captures des besoins fonctionnels pour le module demandeurs visa</w:t>
       </w:r>
     </w:p>
     <w:tbl>
@@ -31403,8 +31400,8 @@
               </w:rPr>
               <w:drawing>
                 <wp:inline distT="0" distB="0" distL="114300" distR="114300">
-                  <wp:extent cx="3430270" cy="2056130"/>
-                  <wp:effectExtent l="0" t="0" r="13970" b="1270"/>
+                  <wp:extent cx="3430270" cy="2113915"/>
+                  <wp:effectExtent l="0" t="0" r="13970" b="4445"/>
                   <wp:docPr id="31" name="Image 31" descr="televers doc"/>
                   <wp:cNvGraphicFramePr>
                     <a:graphicFrameLocks xmlns:a="http://schemas.openxmlformats.org/drawingml/2006/main" noChangeAspect="1"/>
@@ -31427,7 +31424,7 @@
                         <pic:spPr>
                           <a:xfrm>
                             <a:off x="0" y="0"/>
-                            <a:ext cx="3430270" cy="2056130"/>
+                            <a:ext cx="3430270" cy="2113915"/>
                           </a:xfrm>
                           <a:prstGeom prst="rect">
                             <a:avLst/>
@@ -31957,15 +31954,17 @@
             <w:r>
               <w:rPr>
                 <w:rFonts w:hint="default" w:ascii="Times New Roman" w:hAnsi="Times New Roman" w:cs="Times New Roman"/>
-                <w:sz w:val="24"/>
-                <w:szCs w:val="24"/>
-                <w:lang w:val="fr-FR" w:eastAsia="zh-CN"/>
+                <w:b/>
+                <w:bCs/>
+                <w:sz w:val="24"/>
+                <w:szCs w:val="24"/>
+                <w:lang w:val="fr-FR"/>
               </w:rPr>
               <w:drawing>
                 <wp:inline distT="0" distB="0" distL="114300" distR="114300">
-                  <wp:extent cx="3295015" cy="2182495"/>
-                  <wp:effectExtent l="0" t="0" r="12065" b="12065"/>
-                  <wp:docPr id="57" name="Image 57" descr="TELECHARGEMENT E-VISA"/>
+                  <wp:extent cx="3306445" cy="2235200"/>
+                  <wp:effectExtent l="0" t="0" r="635" b="5080"/>
+                  <wp:docPr id="42" name="Image 42" descr="PAIEMENT SECURISE AVEC SUCCES"/>
                   <wp:cNvGraphicFramePr>
                     <a:graphicFrameLocks xmlns:a="http://schemas.openxmlformats.org/drawingml/2006/main" noChangeAspect="1"/>
                   </wp:cNvGraphicFramePr>
@@ -31973,7 +31972,7 @@
                     <a:graphicData uri="http://schemas.openxmlformats.org/drawingml/2006/picture">
                       <pic:pic xmlns:pic="http://schemas.openxmlformats.org/drawingml/2006/picture">
                         <pic:nvPicPr>
-                          <pic:cNvPr id="57" name="Image 57" descr="TELECHARGEMENT E-VISA"/>
+                          <pic:cNvPr id="42" name="Image 42" descr="PAIEMENT SECURISE AVEC SUCCES"/>
                           <pic:cNvPicPr>
                             <a:picLocks noChangeAspect="1"/>
                           </pic:cNvPicPr>
@@ -31987,7 +31986,7 @@
                         <pic:spPr>
                           <a:xfrm>
                             <a:off x="0" y="0"/>
-                            <a:ext cx="3295015" cy="2182495"/>
+                            <a:ext cx="3306445" cy="2235200"/>
                           </a:xfrm>
                           <a:prstGeom prst="rect">
                             <a:avLst/>
@@ -32081,7 +32080,7 @@
                 <w:szCs w:val="24"/>
                 <w:lang w:val="fr-FR"/>
               </w:rPr>
-              <w:t>:téléchargement e-visa PDF</w:t>
+              <w:t>:paiement confirme avec succès</w:t>
             </w:r>
           </w:p>
           <w:p>
@@ -32841,9 +32840,9 @@
               </w:rPr>
               <w:drawing>
                 <wp:inline distT="0" distB="0" distL="114300" distR="114300">
-                  <wp:extent cx="3731895" cy="1923415"/>
-                  <wp:effectExtent l="0" t="0" r="1905" b="12065"/>
-                  <wp:docPr id="59" name="Image 59" descr="CHOIX TYPE VISA demand"/>
+                  <wp:extent cx="3300095" cy="2680970"/>
+                  <wp:effectExtent l="0" t="0" r="6985" b="1270"/>
+                  <wp:docPr id="72" name="Image 72" descr="e-visa genere apres approbation"/>
                   <wp:cNvGraphicFramePr>
                     <a:graphicFrameLocks xmlns:a="http://schemas.openxmlformats.org/drawingml/2006/main" noChangeAspect="1"/>
                   </wp:cNvGraphicFramePr>
@@ -32851,7 +32850,7 @@
                     <a:graphicData uri="http://schemas.openxmlformats.org/drawingml/2006/picture">
                       <pic:pic xmlns:pic="http://schemas.openxmlformats.org/drawingml/2006/picture">
                         <pic:nvPicPr>
-                          <pic:cNvPr id="59" name="Image 59" descr="CHOIX TYPE VISA demand"/>
+                          <pic:cNvPr id="72" name="Image 72" descr="e-visa genere apres approbation"/>
                           <pic:cNvPicPr>
                             <a:picLocks noChangeAspect="1"/>
                           </pic:cNvPicPr>
@@ -32865,7 +32864,7 @@
                         <pic:spPr>
                           <a:xfrm>
                             <a:off x="0" y="0"/>
-                            <a:ext cx="3731895" cy="1923415"/>
+                            <a:ext cx="3300095" cy="2680970"/>
                           </a:xfrm>
                           <a:prstGeom prst="rect">
                             <a:avLst/>
@@ -32959,7 +32958,7 @@
                 <w:szCs w:val="24"/>
                 <w:lang w:val="fr-FR"/>
               </w:rPr>
-              <w:t>: choix type visa lors de la soumission</w:t>
+              <w:t>: générer e-visa après approbation</w:t>
             </w:r>
           </w:p>
           <w:p>
@@ -32969,6 +32968,129 @@
                 <w:lang w:val="fr-FR"/>
               </w:rPr>
             </w:pPr>
+            <w:r>
+              <w:rPr>
+                <w:rFonts w:hint="default"/>
+                <w:lang w:val="fr-FR"/>
+              </w:rPr>
+              <w:drawing>
+                <wp:inline distT="0" distB="0" distL="114300" distR="114300">
+                  <wp:extent cx="3300095" cy="1311275"/>
+                  <wp:effectExtent l="0" t="0" r="6985" b="14605"/>
+                  <wp:docPr id="74" name="Image 74" descr="CAS DE REJETS DEMANDE AVEC MOTIF"/>
+                  <wp:cNvGraphicFramePr>
+                    <a:graphicFrameLocks xmlns:a="http://schemas.openxmlformats.org/drawingml/2006/main" noChangeAspect="1"/>
+                  </wp:cNvGraphicFramePr>
+                  <a:graphic xmlns:a="http://schemas.openxmlformats.org/drawingml/2006/main">
+                    <a:graphicData uri="http://schemas.openxmlformats.org/drawingml/2006/picture">
+                      <pic:pic xmlns:pic="http://schemas.openxmlformats.org/drawingml/2006/picture">
+                        <pic:nvPicPr>
+                          <pic:cNvPr id="74" name="Image 74" descr="CAS DE REJETS DEMANDE AVEC MOTIF"/>
+                          <pic:cNvPicPr>
+                            <a:picLocks noChangeAspect="1"/>
+                          </pic:cNvPicPr>
+                        </pic:nvPicPr>
+                        <pic:blipFill>
+                          <a:blip r:embed="rId30"/>
+                          <a:stretch>
+                            <a:fillRect/>
+                          </a:stretch>
+                        </pic:blipFill>
+                        <pic:spPr>
+                          <a:xfrm>
+                            <a:off x="0" y="0"/>
+                            <a:ext cx="3300095" cy="1311275"/>
+                          </a:xfrm>
+                          <a:prstGeom prst="rect">
+                            <a:avLst/>
+                          </a:prstGeom>
+                        </pic:spPr>
+                      </pic:pic>
+                    </a:graphicData>
+                  </a:graphic>
+                </wp:inline>
+              </w:drawing>
+            </w:r>
+          </w:p>
+          <w:p>
+            <w:pPr>
+              <w:pStyle w:val="13"/>
+              <w:rPr>
+                <w:rFonts w:hint="default"/>
+                <w:lang w:val="fr-FR"/>
+              </w:rPr>
+            </w:pPr>
+            <w:r>
+              <w:rPr>
+                <w:rFonts w:hint="default" w:ascii="Times New Roman" w:hAnsi="Times New Roman" w:cs="Times New Roman"/>
+                <w:b/>
+                <w:bCs/>
+                <w:sz w:val="24"/>
+                <w:szCs w:val="24"/>
+              </w:rPr>
+              <w:t xml:space="preserve">Figure </w:t>
+            </w:r>
+            <w:r>
+              <w:rPr>
+                <w:rFonts w:hint="default" w:ascii="Times New Roman" w:hAnsi="Times New Roman" w:cs="Times New Roman"/>
+                <w:b/>
+                <w:bCs/>
+                <w:sz w:val="24"/>
+                <w:szCs w:val="24"/>
+              </w:rPr>
+              <w:fldChar w:fldCharType="begin"/>
+            </w:r>
+            <w:r>
+              <w:rPr>
+                <w:rFonts w:hint="default" w:ascii="Times New Roman" w:hAnsi="Times New Roman" w:cs="Times New Roman"/>
+                <w:b/>
+                <w:bCs/>
+                <w:sz w:val="24"/>
+                <w:szCs w:val="24"/>
+              </w:rPr>
+              <w:instrText xml:space="preserve"> SEQ Figure \* ARABIC </w:instrText>
+            </w:r>
+            <w:r>
+              <w:rPr>
+                <w:rFonts w:hint="default" w:ascii="Times New Roman" w:hAnsi="Times New Roman" w:cs="Times New Roman"/>
+                <w:b/>
+                <w:bCs/>
+                <w:sz w:val="24"/>
+                <w:szCs w:val="24"/>
+              </w:rPr>
+              <w:fldChar w:fldCharType="separate"/>
+            </w:r>
+            <w:r>
+              <w:rPr>
+                <w:rFonts w:hint="default" w:ascii="Times New Roman" w:hAnsi="Times New Roman" w:cs="Times New Roman"/>
+                <w:b/>
+                <w:bCs/>
+                <w:sz w:val="24"/>
+                <w:szCs w:val="24"/>
+              </w:rPr>
+              <w:t>22</w:t>
+            </w:r>
+            <w:r>
+              <w:rPr>
+                <w:rFonts w:hint="default" w:ascii="Times New Roman" w:hAnsi="Times New Roman" w:cs="Times New Roman"/>
+                <w:b/>
+                <w:bCs/>
+                <w:sz w:val="24"/>
+                <w:szCs w:val="24"/>
+              </w:rPr>
+              <w:fldChar w:fldCharType="end"/>
+            </w:r>
+            <w:r>
+              <w:rPr>
+                <w:rFonts w:hint="default" w:ascii="Times New Roman" w:hAnsi="Times New Roman" w:cs="Times New Roman"/>
+                <w:b/>
+                <w:bCs/>
+                <w:sz w:val="24"/>
+                <w:szCs w:val="24"/>
+                <w:lang w:val="fr-FR"/>
+              </w:rPr>
+              <w:t>: rejet de demande avec motifs</w:t>
+            </w:r>
           </w:p>
         </w:tc>
         <w:tc>
@@ -32993,11 +33115,143 @@
               <w:spacing w:line="360" w:lineRule="auto"/>
               <w:jc w:val="left"/>
               <w:rPr>
+                <w:rFonts w:hint="default"/>
+                <w:lang w:val="fr-FR"/>
+              </w:rPr>
+            </w:pPr>
+            <w:r>
+              <w:rPr>
+                <w:rFonts w:hint="default"/>
+                <w:lang w:val="fr-FR"/>
+              </w:rPr>
+              <w:drawing>
+                <wp:inline distT="0" distB="0" distL="114300" distR="114300">
+                  <wp:extent cx="3307715" cy="4031615"/>
+                  <wp:effectExtent l="0" t="0" r="14605" b="6985"/>
+                  <wp:docPr id="73" name="Image 73" descr="e-visa telecharger pdf"/>
+                  <wp:cNvGraphicFramePr>
+                    <a:graphicFrameLocks xmlns:a="http://schemas.openxmlformats.org/drawingml/2006/main" noChangeAspect="1"/>
+                  </wp:cNvGraphicFramePr>
+                  <a:graphic xmlns:a="http://schemas.openxmlformats.org/drawingml/2006/main">
+                    <a:graphicData uri="http://schemas.openxmlformats.org/drawingml/2006/picture">
+                      <pic:pic xmlns:pic="http://schemas.openxmlformats.org/drawingml/2006/picture">
+                        <pic:nvPicPr>
+                          <pic:cNvPr id="73" name="Image 73" descr="e-visa telecharger pdf"/>
+                          <pic:cNvPicPr>
+                            <a:picLocks noChangeAspect="1"/>
+                          </pic:cNvPicPr>
+                        </pic:nvPicPr>
+                        <pic:blipFill>
+                          <a:blip r:embed="rId31"/>
+                          <a:stretch>
+                            <a:fillRect/>
+                          </a:stretch>
+                        </pic:blipFill>
+                        <pic:spPr>
+                          <a:xfrm>
+                            <a:off x="0" y="0"/>
+                            <a:ext cx="3307715" cy="4031615"/>
+                          </a:xfrm>
+                          <a:prstGeom prst="rect">
+                            <a:avLst/>
+                          </a:prstGeom>
+                        </pic:spPr>
+                      </pic:pic>
+                    </a:graphicData>
+                  </a:graphic>
+                </wp:inline>
+              </w:drawing>
+            </w:r>
+          </w:p>
+          <w:p>
+            <w:pPr>
+              <w:pStyle w:val="13"/>
+              <w:rPr>
                 <w:rFonts w:hint="default" w:ascii="Times New Roman" w:hAnsi="Times New Roman" w:cs="Times New Roman"/>
                 <w:b/>
                 <w:bCs/>
                 <w:sz w:val="24"/>
                 <w:szCs w:val="24"/>
+                <w:lang w:val="fr-FR"/>
+              </w:rPr>
+            </w:pPr>
+            <w:r>
+              <w:rPr>
+                <w:rFonts w:hint="default" w:ascii="Times New Roman" w:hAnsi="Times New Roman" w:cs="Times New Roman"/>
+                <w:b/>
+                <w:bCs/>
+                <w:sz w:val="24"/>
+                <w:szCs w:val="24"/>
+              </w:rPr>
+              <w:t xml:space="preserve">Figure </w:t>
+            </w:r>
+            <w:r>
+              <w:rPr>
+                <w:rFonts w:hint="default" w:ascii="Times New Roman" w:hAnsi="Times New Roman" w:cs="Times New Roman"/>
+                <w:b/>
+                <w:bCs/>
+                <w:sz w:val="24"/>
+                <w:szCs w:val="24"/>
+              </w:rPr>
+              <w:fldChar w:fldCharType="begin"/>
+            </w:r>
+            <w:r>
+              <w:rPr>
+                <w:rFonts w:hint="default" w:ascii="Times New Roman" w:hAnsi="Times New Roman" w:cs="Times New Roman"/>
+                <w:b/>
+                <w:bCs/>
+                <w:sz w:val="24"/>
+                <w:szCs w:val="24"/>
+              </w:rPr>
+              <w:instrText xml:space="preserve"> SEQ Figure \* ARABIC </w:instrText>
+            </w:r>
+            <w:r>
+              <w:rPr>
+                <w:rFonts w:hint="default" w:ascii="Times New Roman" w:hAnsi="Times New Roman" w:cs="Times New Roman"/>
+                <w:b/>
+                <w:bCs/>
+                <w:sz w:val="24"/>
+                <w:szCs w:val="24"/>
+              </w:rPr>
+              <w:fldChar w:fldCharType="separate"/>
+            </w:r>
+            <w:r>
+              <w:rPr>
+                <w:rFonts w:hint="default" w:ascii="Times New Roman" w:hAnsi="Times New Roman" w:cs="Times New Roman"/>
+                <w:b/>
+                <w:bCs/>
+                <w:sz w:val="24"/>
+                <w:szCs w:val="24"/>
+              </w:rPr>
+              <w:t>23</w:t>
+            </w:r>
+            <w:r>
+              <w:rPr>
+                <w:rFonts w:hint="default" w:ascii="Times New Roman" w:hAnsi="Times New Roman" w:cs="Times New Roman"/>
+                <w:b/>
+                <w:bCs/>
+                <w:sz w:val="24"/>
+                <w:szCs w:val="24"/>
+              </w:rPr>
+              <w:fldChar w:fldCharType="end"/>
+            </w:r>
+            <w:r>
+              <w:rPr>
+                <w:rFonts w:hint="default" w:ascii="Times New Roman" w:hAnsi="Times New Roman" w:cs="Times New Roman"/>
+                <w:b/>
+                <w:bCs/>
+                <w:sz w:val="24"/>
+                <w:szCs w:val="24"/>
+                <w:lang w:val="fr-FR"/>
+              </w:rPr>
+              <w:t>: téléchargement e-visa format PDF</w:t>
+            </w:r>
+          </w:p>
+          <w:p>
+            <w:pPr>
+              <w:rPr>
+                <w:rFonts w:hint="default"/>
+                <w:lang w:val="fr-FR"/>
               </w:rPr>
             </w:pPr>
           </w:p>
@@ -33023,6 +33277,82 @@
           </w:p>
         </w:tc>
       </w:tr>
+      <w:tr>
+        <w:tblPrEx>
+          <w:tblBorders>
+            <w:top w:val="dotted" w:color="FFFFFF" w:themeColor="background1" w:sz="4" w:space="0"/>
+            <w:left w:val="dotted" w:color="FFFFFF" w:themeColor="background1" w:sz="4" w:space="0"/>
+            <w:bottom w:val="dotted" w:color="FFFFFF" w:themeColor="background1" w:sz="4" w:space="0"/>
+            <w:right w:val="dotted" w:color="FFFFFF" w:themeColor="background1" w:sz="4" w:space="0"/>
+            <w:insideH w:val="dotted" w:color="FFFFFF" w:themeColor="background1" w:sz="4" w:space="0"/>
+            <w:insideV w:val="dotted" w:color="FFFFFF" w:themeColor="background1" w:sz="4" w:space="0"/>
+          </w:tblBorders>
+          <w:tblCellMar>
+            <w:top w:w="0" w:type="dxa"/>
+            <w:left w:w="108" w:type="dxa"/>
+            <w:bottom w:w="0" w:type="dxa"/>
+            <w:right w:w="108" w:type="dxa"/>
+          </w:tblCellMar>
+        </w:tblPrEx>
+        <w:tc>
+          <w:tcPr>
+            <w:tcW w:w="5425" w:type="dxa"/>
+            <w:tcBorders>
+              <w:tl2br w:val="nil"/>
+              <w:tr2bl w:val="nil"/>
+            </w:tcBorders>
+          </w:tcPr>
+          <w:p>
+            <w:pPr>
+              <w:rPr>
+                <w:rFonts w:hint="default"/>
+                <w:lang w:val="fr-FR"/>
+              </w:rPr>
+            </w:pPr>
+          </w:p>
+        </w:tc>
+        <w:tc>
+          <w:tcPr>
+            <w:tcW w:w="5426" w:type="dxa"/>
+            <w:tcBorders>
+              <w:tl2br w:val="nil"/>
+              <w:tr2bl w:val="nil"/>
+            </w:tcBorders>
+          </w:tcPr>
+          <w:p>
+            <w:pPr>
+              <w:pStyle w:val="13"/>
+              <w:rPr>
+                <w:rFonts w:hint="default" w:ascii="Times New Roman" w:hAnsi="Times New Roman" w:cs="Times New Roman"/>
+                <w:b/>
+                <w:bCs/>
+                <w:sz w:val="24"/>
+                <w:szCs w:val="24"/>
+              </w:rPr>
+            </w:pPr>
+          </w:p>
+        </w:tc>
+        <w:tc>
+          <w:tcPr>
+            <w:tcW w:w="5426" w:type="dxa"/>
+            <w:tcBorders>
+              <w:tl2br w:val="nil"/>
+              <w:tr2bl w:val="nil"/>
+            </w:tcBorders>
+          </w:tcPr>
+          <w:p>
+            <w:pPr>
+              <w:rPr>
+                <w:rFonts w:hint="default" w:ascii="Times New Roman" w:hAnsi="Times New Roman" w:cs="Times New Roman"/>
+                <w:b/>
+                <w:bCs/>
+                <w:sz w:val="24"/>
+                <w:szCs w:val="24"/>
+              </w:rPr>
+            </w:pPr>
+          </w:p>
+        </w:tc>
+      </w:tr>
     </w:tbl>
     <w:p>
       <w:pPr>
@@ -33144,7 +33474,7 @@
           <w:szCs w:val="24"/>
           <w:lang w:val="fr-FR"/>
         </w:rPr>
-        <w:t xml:space="preserve">: captures besoins administrateur </w:t>
+        <w:t xml:space="preserve">: captures des besoins fonctionnels pour le module administrateur </w:t>
       </w:r>
     </w:p>
     <w:tbl>
@@ -33236,9 +33566,9 @@
               </w:rPr>
               <w:drawing>
                 <wp:inline distT="0" distB="0" distL="114300" distR="114300">
-                  <wp:extent cx="3445510" cy="2265680"/>
-                  <wp:effectExtent l="0" t="0" r="13970" b="5080"/>
-                  <wp:docPr id="61" name="Image 61" descr="DASHBOARD ADMIN NEW"/>
+                  <wp:extent cx="3449320" cy="2239645"/>
+                  <wp:effectExtent l="0" t="0" r="10160" b="635"/>
+                  <wp:docPr id="75" name="Image 75" descr="DASHBOARD ADMIN NEW"/>
                   <wp:cNvGraphicFramePr>
                     <a:graphicFrameLocks xmlns:a="http://schemas.openxmlformats.org/drawingml/2006/main" noChangeAspect="1"/>
                   </wp:cNvGraphicFramePr>
@@ -33246,13 +33576,13 @@
                     <a:graphicData uri="http://schemas.openxmlformats.org/drawingml/2006/picture">
                       <pic:pic xmlns:pic="http://schemas.openxmlformats.org/drawingml/2006/picture">
                         <pic:nvPicPr>
-                          <pic:cNvPr id="61" name="Image 61" descr="DASHBOARD ADMIN NEW"/>
+                          <pic:cNvPr id="75" name="Image 75" descr="DASHBOARD ADMIN NEW"/>
                           <pic:cNvPicPr>
                             <a:picLocks noChangeAspect="1"/>
                           </pic:cNvPicPr>
                         </pic:nvPicPr>
                         <pic:blipFill>
-                          <a:blip r:embed="rId30"/>
+                          <a:blip r:embed="rId32"/>
                           <a:stretch>
                             <a:fillRect/>
                           </a:stretch>
@@ -33260,7 +33590,7 @@
                         <pic:spPr>
                           <a:xfrm>
                             <a:off x="0" y="0"/>
-                            <a:ext cx="3445510" cy="2265680"/>
+                            <a:ext cx="3449320" cy="2239645"/>
                           </a:xfrm>
                           <a:prstGeom prst="rect">
                             <a:avLst/>
@@ -33346,7 +33676,7 @@
                 <w:sz w:val="24"/>
                 <w:szCs w:val="24"/>
               </w:rPr>
-              <w:t>22</w:t>
+              <w:t>24</w:t>
             </w:r>
             <w:r>
               <w:rPr>
@@ -33433,7 +33763,7 @@
                           </pic:cNvPicPr>
                         </pic:nvPicPr>
                         <pic:blipFill>
-                          <a:blip r:embed="rId31"/>
+                          <a:blip r:embed="rId33"/>
                           <a:stretch>
                             <a:fillRect/>
                           </a:stretch>
@@ -33527,7 +33857,7 @@
                 <w:sz w:val="24"/>
                 <w:szCs w:val="24"/>
               </w:rPr>
-              <w:t>23</w:t>
+              <w:t>25</w:t>
             </w:r>
             <w:r>
               <w:rPr>
@@ -33663,7 +33993,7 @@
                           </pic:cNvPicPr>
                         </pic:nvPicPr>
                         <pic:blipFill>
-                          <a:blip r:embed="rId32"/>
+                          <a:blip r:embed="rId34"/>
                           <a:stretch>
                             <a:fillRect/>
                           </a:stretch>
@@ -33757,7 +34087,7 @@
                 <w:sz w:val="24"/>
                 <w:szCs w:val="24"/>
               </w:rPr>
-              <w:t>24</w:t>
+              <w:t>26</w:t>
             </w:r>
             <w:r>
               <w:rPr>
@@ -33844,7 +34174,7 @@
                           </pic:cNvPicPr>
                         </pic:nvPicPr>
                         <pic:blipFill>
-                          <a:blip r:embed="rId33"/>
+                          <a:blip r:embed="rId35"/>
                           <a:stretch>
                             <a:fillRect/>
                           </a:stretch>
@@ -33938,7 +34268,7 @@
                 <w:sz w:val="24"/>
                 <w:szCs w:val="24"/>
               </w:rPr>
-              <w:t>25</w:t>
+              <w:t>27</w:t>
             </w:r>
             <w:r>
               <w:rPr>
@@ -34054,8 +34384,8 @@
               </w:rPr>
               <w:drawing>
                 <wp:inline distT="0" distB="0" distL="114300" distR="114300">
-                  <wp:extent cx="3453130" cy="1924685"/>
-                  <wp:effectExtent l="0" t="0" r="6350" b="10795"/>
+                  <wp:extent cx="3453130" cy="2470150"/>
+                  <wp:effectExtent l="0" t="0" r="6350" b="13970"/>
                   <wp:docPr id="63" name="Image 63" descr="MODELES EMAILS NEW"/>
                   <wp:cNvGraphicFramePr>
                     <a:graphicFrameLocks xmlns:a="http://schemas.openxmlformats.org/drawingml/2006/main" noChangeAspect="1"/>
@@ -34070,7 +34400,7 @@
                           </pic:cNvPicPr>
                         </pic:nvPicPr>
                         <pic:blipFill>
-                          <a:blip r:embed="rId34"/>
+                          <a:blip r:embed="rId36"/>
                           <a:stretch>
                             <a:fillRect/>
                           </a:stretch>
@@ -34078,7 +34408,7 @@
                         <pic:spPr>
                           <a:xfrm>
                             <a:off x="0" y="0"/>
-                            <a:ext cx="3453130" cy="1924685"/>
+                            <a:ext cx="3453130" cy="2470150"/>
                           </a:xfrm>
                           <a:prstGeom prst="rect">
                             <a:avLst/>
@@ -34138,7 +34468,7 @@
                 <w:sz w:val="24"/>
                 <w:szCs w:val="24"/>
               </w:rPr>
-              <w:t>26</w:t>
+              <w:t>28</w:t>
             </w:r>
             <w:r>
               <w:rPr>
@@ -34209,8 +34539,8 @@
               </w:rPr>
               <w:drawing>
                 <wp:inline distT="0" distB="0" distL="114300" distR="114300">
-                  <wp:extent cx="3359150" cy="1927225"/>
-                  <wp:effectExtent l="0" t="0" r="8890" b="8255"/>
+                  <wp:extent cx="3359150" cy="2458085"/>
+                  <wp:effectExtent l="0" t="0" r="8890" b="10795"/>
                   <wp:docPr id="40" name="Image 40" descr="support &amp; messages"/>
                   <wp:cNvGraphicFramePr>
                     <a:graphicFrameLocks xmlns:a="http://schemas.openxmlformats.org/drawingml/2006/main" noChangeAspect="1"/>
@@ -34225,7 +34555,7 @@
                           </pic:cNvPicPr>
                         </pic:nvPicPr>
                         <pic:blipFill>
-                          <a:blip r:embed="rId35"/>
+                          <a:blip r:embed="rId37"/>
                           <a:stretch>
                             <a:fillRect/>
                           </a:stretch>
@@ -34233,7 +34563,7 @@
                         <pic:spPr>
                           <a:xfrm>
                             <a:off x="0" y="0"/>
-                            <a:ext cx="3359150" cy="1927225"/>
+                            <a:ext cx="3359150" cy="2458085"/>
                           </a:xfrm>
                           <a:prstGeom prst="rect">
                             <a:avLst/>
@@ -34319,7 +34649,7 @@
                 <w:sz w:val="24"/>
                 <w:szCs w:val="24"/>
               </w:rPr>
-              <w:t>27</w:t>
+              <w:t>29</w:t>
             </w:r>
             <w:r>
               <w:rPr>
@@ -34443,8 +34773,8 @@
               </w:rPr>
               <w:drawing>
                 <wp:inline distT="0" distB="0" distL="114300" distR="114300">
-                  <wp:extent cx="3390900" cy="1646555"/>
-                  <wp:effectExtent l="0" t="0" r="7620" b="14605"/>
+                  <wp:extent cx="3390900" cy="2404745"/>
+                  <wp:effectExtent l="0" t="0" r="7620" b="3175"/>
                   <wp:docPr id="41" name="Image 41" descr="parametres systeme"/>
                   <wp:cNvGraphicFramePr>
                     <a:graphicFrameLocks xmlns:a="http://schemas.openxmlformats.org/drawingml/2006/main" noChangeAspect="1"/>
@@ -34459,7 +34789,7 @@
                           </pic:cNvPicPr>
                         </pic:nvPicPr>
                         <pic:blipFill>
-                          <a:blip r:embed="rId36"/>
+                          <a:blip r:embed="rId38"/>
                           <a:stretch>
                             <a:fillRect/>
                           </a:stretch>
@@ -34467,7 +34797,7 @@
                         <pic:spPr>
                           <a:xfrm>
                             <a:off x="0" y="0"/>
-                            <a:ext cx="3390900" cy="1646555"/>
+                            <a:ext cx="3390900" cy="2404745"/>
                           </a:xfrm>
                           <a:prstGeom prst="rect">
                             <a:avLst/>
@@ -34553,7 +34883,7 @@
                 <w:sz w:val="24"/>
                 <w:szCs w:val="24"/>
               </w:rPr>
-              <w:t>28</w:t>
+              <w:t>30</w:t>
             </w:r>
             <w:r>
               <w:rPr>
@@ -34619,9 +34949,9 @@
               </w:rPr>
               <w:drawing>
                 <wp:inline distT="0" distB="0" distL="114300" distR="114300">
-                  <wp:extent cx="3365500" cy="1603375"/>
-                  <wp:effectExtent l="0" t="0" r="2540" b="12065"/>
-                  <wp:docPr id="65" name="Image 65" descr="RAPPORTS ET STATITISTIQUE"/>
+                  <wp:extent cx="3355975" cy="2395855"/>
+                  <wp:effectExtent l="0" t="0" r="12065" b="12065"/>
+                  <wp:docPr id="76" name="Image 76" descr="statistiques"/>
                   <wp:cNvGraphicFramePr>
                     <a:graphicFrameLocks xmlns:a="http://schemas.openxmlformats.org/drawingml/2006/main" noChangeAspect="1"/>
                   </wp:cNvGraphicFramePr>
@@ -34629,13 +34959,13 @@
                     <a:graphicData uri="http://schemas.openxmlformats.org/drawingml/2006/picture">
                       <pic:pic xmlns:pic="http://schemas.openxmlformats.org/drawingml/2006/picture">
                         <pic:nvPicPr>
-                          <pic:cNvPr id="65" name="Image 65" descr="RAPPORTS ET STATITISTIQUE"/>
+                          <pic:cNvPr id="76" name="Image 76" descr="statistiques"/>
                           <pic:cNvPicPr>
                             <a:picLocks noChangeAspect="1"/>
                           </pic:cNvPicPr>
                         </pic:nvPicPr>
                         <pic:blipFill>
-                          <a:blip r:embed="rId37"/>
+                          <a:blip r:embed="rId39"/>
                           <a:stretch>
                             <a:fillRect/>
                           </a:stretch>
@@ -34643,7 +34973,7 @@
                         <pic:spPr>
                           <a:xfrm>
                             <a:off x="0" y="0"/>
-                            <a:ext cx="3365500" cy="1603375"/>
+                            <a:ext cx="3355975" cy="2395855"/>
                           </a:xfrm>
                           <a:prstGeom prst="rect">
                             <a:avLst/>
@@ -34712,7 +35042,7 @@
                 <w:sz w:val="24"/>
                 <w:szCs w:val="24"/>
               </w:rPr>
-              <w:t>29</w:t>
+              <w:t>31</w:t>
             </w:r>
             <w:r>
               <w:rPr>
@@ -34810,6 +35140,7 @@
         <w:keepLines w:val="0"/>
         <w:widowControl/>
         <w:numPr>
+          <w:ilvl w:val="0"/>
           <w:numId w:val="0"/>
         </w:numPr>
         <w:suppressLineNumbers w:val="0"/>
@@ -34910,26 +35241,27 @@
           <w:szCs w:val="24"/>
           <w:lang w:val="fr-FR"/>
         </w:rPr>
-        <w:t>: captures besoins agent immigration</w:t>
-      </w:r>
-      <w:bookmarkStart w:id="0" w:name="_GoBack"/>
-      <w:bookmarkEnd w:id="0"/>
+        <w:t>: captures des besoins fonctionnels pour le module agent immigration</w:t>
+      </w:r>
     </w:p>
     <w:tbl>
       <w:tblPr>
+        <w:tblStyle w:val="17"/>
         <w:tblW w:w="11449" w:type="dxa"/>
         <w:tblInd w:w="-1479" w:type="dxa"/>
         <w:tblBorders>
-          <w:top w:val="single" w:color="auto" w:sz="4" w:space="0"/>
-          <w:left w:val="single" w:color="auto" w:sz="4" w:space="0"/>
-          <w:bottom w:val="single" w:color="auto" w:sz="4" w:space="0"/>
-          <w:right w:val="single" w:color="auto" w:sz="4" w:space="0"/>
-          <w:insideH w:val="single" w:color="auto" w:sz="4" w:space="0"/>
-          <w:insideV w:val="single" w:color="auto" w:sz="4" w:space="0"/>
+          <w:top w:val="single" w:color="FFFFFF" w:themeColor="background1" w:sz="4" w:space="0"/>
+          <w:left w:val="single" w:color="FFFFFF" w:themeColor="background1" w:sz="4" w:space="0"/>
+          <w:bottom w:val="single" w:color="FFFFFF" w:themeColor="background1" w:sz="4" w:space="0"/>
+          <w:right w:val="single" w:color="FFFFFF" w:themeColor="background1" w:sz="4" w:space="0"/>
+          <w:insideH w:val="single" w:color="FFFFFF" w:themeColor="background1" w:sz="4" w:space="0"/>
+          <w:insideV w:val="single" w:color="FFFFFF" w:themeColor="background1" w:sz="4" w:space="0"/>
         </w:tblBorders>
         <w:tblLayout w:type="autofit"/>
         <w:tblCellMar>
+          <w:top w:w="0" w:type="dxa"/>
           <w:left w:w="108" w:type="dxa"/>
+          <w:bottom w:w="0" w:type="dxa"/>
           <w:right w:w="108" w:type="dxa"/>
         </w:tblCellMar>
       </w:tblPr>
@@ -34940,21 +35272,27 @@
       <w:tr>
         <w:tblPrEx>
           <w:tblBorders>
-            <w:top w:val="single" w:color="auto" w:sz="4" w:space="0"/>
-            <w:left w:val="single" w:color="auto" w:sz="4" w:space="0"/>
-            <w:bottom w:val="single" w:color="auto" w:sz="4" w:space="0"/>
-            <w:right w:val="single" w:color="auto" w:sz="4" w:space="0"/>
-            <w:insideH w:val="single" w:color="auto" w:sz="4" w:space="0"/>
-            <w:insideV w:val="single" w:color="auto" w:sz="4" w:space="0"/>
+            <w:top w:val="single" w:color="FFFFFF" w:themeColor="background1" w:sz="4" w:space="0"/>
+            <w:left w:val="single" w:color="FFFFFF" w:themeColor="background1" w:sz="4" w:space="0"/>
+            <w:bottom w:val="single" w:color="FFFFFF" w:themeColor="background1" w:sz="4" w:space="0"/>
+            <w:right w:val="single" w:color="FFFFFF" w:themeColor="background1" w:sz="4" w:space="0"/>
+            <w:insideH w:val="single" w:color="FFFFFF" w:themeColor="background1" w:sz="4" w:space="0"/>
+            <w:insideV w:val="single" w:color="FFFFFF" w:themeColor="background1" w:sz="4" w:space="0"/>
           </w:tblBorders>
           <w:tblCellMar>
+            <w:top w:w="0" w:type="dxa"/>
             <w:left w:w="108" w:type="dxa"/>
+            <w:bottom w:w="0" w:type="dxa"/>
             <w:right w:w="108" w:type="dxa"/>
           </w:tblCellMar>
         </w:tblPrEx>
         <w:tc>
           <w:tcPr>
             <w:tcW w:w="5740" w:type="dxa"/>
+            <w:tcBorders>
+              <w:tl2br w:val="nil"/>
+              <w:tr2bl w:val="nil"/>
+            </w:tcBorders>
           </w:tcPr>
           <w:p>
             <w:pPr>
@@ -34962,6 +35300,7 @@
               <w:keepLines w:val="0"/>
               <w:widowControl/>
               <w:numPr>
+                <w:ilvl w:val="0"/>
                 <w:numId w:val="0"/>
               </w:numPr>
               <w:suppressLineNumbers w:val="0"/>
@@ -35011,7 +35350,7 @@
                           </pic:cNvPicPr>
                         </pic:nvPicPr>
                         <pic:blipFill>
-                          <a:blip r:embed="rId38"/>
+                          <a:blip r:embed="rId40"/>
                           <a:stretch>
                             <a:fillRect/>
                           </a:stretch>
@@ -35039,6 +35378,7 @@
               <w:keepLines w:val="0"/>
               <w:widowControl/>
               <w:numPr>
+                <w:ilvl w:val="0"/>
                 <w:numId w:val="0"/>
               </w:numPr>
               <w:suppressLineNumbers w:val="0"/>
@@ -35105,7 +35445,7 @@
                 <w:sz w:val="24"/>
                 <w:szCs w:val="24"/>
               </w:rPr>
-              <w:t>30</w:t>
+              <w:t>32</w:t>
             </w:r>
             <w:r>
               <w:rPr>
@@ -35133,6 +35473,10 @@
         <w:tc>
           <w:tcPr>
             <w:tcW w:w="5709" w:type="dxa"/>
+            <w:tcBorders>
+              <w:tl2br w:val="nil"/>
+              <w:tr2bl w:val="nil"/>
+            </w:tcBorders>
           </w:tcPr>
           <w:p>
             <w:pPr>
@@ -35140,6 +35484,7 @@
               <w:keepLines w:val="0"/>
               <w:widowControl/>
               <w:numPr>
+                <w:ilvl w:val="0"/>
                 <w:numId w:val="0"/>
               </w:numPr>
               <w:suppressLineNumbers w:val="0"/>
@@ -35189,7 +35534,7 @@
                           </pic:cNvPicPr>
                         </pic:nvPicPr>
                         <pic:blipFill>
-                          <a:blip r:embed="rId39"/>
+                          <a:blip r:embed="rId41"/>
                           <a:stretch>
                             <a:fillRect/>
                           </a:stretch>
@@ -35217,6 +35562,7 @@
               <w:keepLines w:val="0"/>
               <w:widowControl/>
               <w:numPr>
+                <w:ilvl w:val="0"/>
                 <w:numId w:val="0"/>
               </w:numPr>
               <w:suppressLineNumbers w:val="0"/>
@@ -35283,7 +35629,7 @@
                 <w:sz w:val="24"/>
                 <w:szCs w:val="24"/>
               </w:rPr>
-              <w:t>31</w:t>
+              <w:t>33</w:t>
             </w:r>
             <w:r>
               <w:rPr>
@@ -35312,21 +35658,27 @@
       <w:tr>
         <w:tblPrEx>
           <w:tblBorders>
-            <w:top w:val="single" w:color="auto" w:sz="4" w:space="0"/>
-            <w:left w:val="single" w:color="auto" w:sz="4" w:space="0"/>
-            <w:bottom w:val="single" w:color="auto" w:sz="4" w:space="0"/>
-            <w:right w:val="single" w:color="auto" w:sz="4" w:space="0"/>
-            <w:insideH w:val="single" w:color="auto" w:sz="4" w:space="0"/>
-            <w:insideV w:val="single" w:color="auto" w:sz="4" w:space="0"/>
+            <w:top w:val="single" w:color="FFFFFF" w:themeColor="background1" w:sz="4" w:space="0"/>
+            <w:left w:val="single" w:color="FFFFFF" w:themeColor="background1" w:sz="4" w:space="0"/>
+            <w:bottom w:val="single" w:color="FFFFFF" w:themeColor="background1" w:sz="4" w:space="0"/>
+            <w:right w:val="single" w:color="FFFFFF" w:themeColor="background1" w:sz="4" w:space="0"/>
+            <w:insideH w:val="single" w:color="FFFFFF" w:themeColor="background1" w:sz="4" w:space="0"/>
+            <w:insideV w:val="single" w:color="FFFFFF" w:themeColor="background1" w:sz="4" w:space="0"/>
           </w:tblBorders>
           <w:tblCellMar>
+            <w:top w:w="0" w:type="dxa"/>
             <w:left w:w="108" w:type="dxa"/>
+            <w:bottom w:w="0" w:type="dxa"/>
             <w:right w:w="108" w:type="dxa"/>
           </w:tblCellMar>
         </w:tblPrEx>
         <w:tc>
           <w:tcPr>
             <w:tcW w:w="5740" w:type="dxa"/>
+            <w:tcBorders>
+              <w:tl2br w:val="nil"/>
+              <w:tr2bl w:val="nil"/>
+            </w:tcBorders>
           </w:tcPr>
           <w:p>
             <w:pPr>
@@ -35334,6 +35686,7 @@
               <w:keepLines w:val="0"/>
               <w:widowControl/>
               <w:numPr>
+                <w:ilvl w:val="0"/>
                 <w:numId w:val="0"/>
               </w:numPr>
               <w:suppressLineNumbers w:val="0"/>
@@ -35352,11 +35705,164 @@
                 <w:lang w:val="fr-FR" w:eastAsia="zh-CN" w:bidi="ar"/>
               </w:rPr>
             </w:pPr>
+            <w:r>
+              <w:rPr>
+                <w:rFonts w:hint="default" w:ascii="Times New Roman" w:hAnsi="Times New Roman" w:eastAsia="SimSun" w:cs="Times New Roman"/>
+                <w:b/>
+                <w:bCs/>
+                <w:color w:val="000000"/>
+                <w:kern w:val="0"/>
+                <w:sz w:val="24"/>
+                <w:szCs w:val="24"/>
+                <w:u w:val="single"/>
+                <w:vertAlign w:val="baseline"/>
+                <w:lang w:val="fr-FR" w:eastAsia="zh-CN" w:bidi="ar"/>
+              </w:rPr>
+              <w:drawing>
+                <wp:inline distT="0" distB="0" distL="114300" distR="114300">
+                  <wp:extent cx="3565525" cy="1786890"/>
+                  <wp:effectExtent l="0" t="0" r="635" b="11430"/>
+                  <wp:docPr id="56" name="Image 56" descr="DOCUMENTS REQUIS AGENT IMMI"/>
+                  <wp:cNvGraphicFramePr>
+                    <a:graphicFrameLocks xmlns:a="http://schemas.openxmlformats.org/drawingml/2006/main" noChangeAspect="1"/>
+                  </wp:cNvGraphicFramePr>
+                  <a:graphic xmlns:a="http://schemas.openxmlformats.org/drawingml/2006/main">
+                    <a:graphicData uri="http://schemas.openxmlformats.org/drawingml/2006/picture">
+                      <pic:pic xmlns:pic="http://schemas.openxmlformats.org/drawingml/2006/picture">
+                        <pic:nvPicPr>
+                          <pic:cNvPr id="56" name="Image 56" descr="DOCUMENTS REQUIS AGENT IMMI"/>
+                          <pic:cNvPicPr>
+                            <a:picLocks noChangeAspect="1"/>
+                          </pic:cNvPicPr>
+                        </pic:nvPicPr>
+                        <pic:blipFill>
+                          <a:blip r:embed="rId42"/>
+                          <a:stretch>
+                            <a:fillRect/>
+                          </a:stretch>
+                        </pic:blipFill>
+                        <pic:spPr>
+                          <a:xfrm>
+                            <a:off x="0" y="0"/>
+                            <a:ext cx="3565525" cy="1786890"/>
+                          </a:xfrm>
+                          <a:prstGeom prst="rect">
+                            <a:avLst/>
+                          </a:prstGeom>
+                        </pic:spPr>
+                      </pic:pic>
+                    </a:graphicData>
+                  </a:graphic>
+                </wp:inline>
+              </w:drawing>
+            </w:r>
+          </w:p>
+          <w:p>
+            <w:pPr>
+              <w:pStyle w:val="13"/>
+              <w:keepNext w:val="0"/>
+              <w:keepLines w:val="0"/>
+              <w:widowControl/>
+              <w:numPr>
+                <w:ilvl w:val="0"/>
+                <w:numId w:val="0"/>
+              </w:numPr>
+              <w:suppressLineNumbers w:val="0"/>
+              <w:spacing w:line="360" w:lineRule="auto"/>
+              <w:jc w:val="left"/>
+              <w:rPr>
+                <w:rFonts w:hint="default" w:ascii="Times New Roman" w:hAnsi="Times New Roman" w:eastAsia="SimSun" w:cs="Times New Roman"/>
+                <w:b/>
+                <w:bCs/>
+                <w:color w:val="000000"/>
+                <w:kern w:val="0"/>
+                <w:sz w:val="24"/>
+                <w:szCs w:val="24"/>
+                <w:u w:val="single"/>
+                <w:vertAlign w:val="baseline"/>
+                <w:lang w:val="fr-FR" w:eastAsia="zh-CN" w:bidi="ar"/>
+              </w:rPr>
+            </w:pPr>
+            <w:r>
+              <w:rPr>
+                <w:rFonts w:hint="default" w:ascii="Times New Roman" w:hAnsi="Times New Roman" w:cs="Times New Roman"/>
+                <w:b/>
+                <w:bCs/>
+                <w:sz w:val="24"/>
+                <w:szCs w:val="24"/>
+              </w:rPr>
+              <w:t xml:space="preserve">Figure </w:t>
+            </w:r>
+            <w:r>
+              <w:rPr>
+                <w:rFonts w:hint="default" w:ascii="Times New Roman" w:hAnsi="Times New Roman" w:cs="Times New Roman"/>
+                <w:b/>
+                <w:bCs/>
+                <w:sz w:val="24"/>
+                <w:szCs w:val="24"/>
+              </w:rPr>
+              <w:fldChar w:fldCharType="begin"/>
+            </w:r>
+            <w:r>
+              <w:rPr>
+                <w:rFonts w:hint="default" w:ascii="Times New Roman" w:hAnsi="Times New Roman" w:cs="Times New Roman"/>
+                <w:b/>
+                <w:bCs/>
+                <w:sz w:val="24"/>
+                <w:szCs w:val="24"/>
+              </w:rPr>
+              <w:instrText xml:space="preserve"> SEQ Figure \* ARABIC </w:instrText>
+            </w:r>
+            <w:r>
+              <w:rPr>
+                <w:rFonts w:hint="default" w:ascii="Times New Roman" w:hAnsi="Times New Roman" w:cs="Times New Roman"/>
+                <w:b/>
+                <w:bCs/>
+                <w:sz w:val="24"/>
+                <w:szCs w:val="24"/>
+              </w:rPr>
+              <w:fldChar w:fldCharType="separate"/>
+            </w:r>
+            <w:r>
+              <w:rPr>
+                <w:rFonts w:hint="default" w:ascii="Times New Roman" w:hAnsi="Times New Roman" w:cs="Times New Roman"/>
+                <w:b/>
+                <w:bCs/>
+                <w:sz w:val="24"/>
+                <w:szCs w:val="24"/>
+              </w:rPr>
+              <w:t>34</w:t>
+            </w:r>
+            <w:r>
+              <w:rPr>
+                <w:rFonts w:hint="default" w:ascii="Times New Roman" w:hAnsi="Times New Roman" w:cs="Times New Roman"/>
+                <w:b/>
+                <w:bCs/>
+                <w:sz w:val="24"/>
+                <w:szCs w:val="24"/>
+              </w:rPr>
+              <w:fldChar w:fldCharType="end"/>
+            </w:r>
+            <w:r>
+              <w:rPr>
+                <w:rFonts w:hint="default" w:ascii="Times New Roman" w:hAnsi="Times New Roman" w:cs="Times New Roman"/>
+                <w:b/>
+                <w:bCs/>
+                <w:sz w:val="24"/>
+                <w:szCs w:val="24"/>
+                <w:lang w:val="fr-FR"/>
+              </w:rPr>
+              <w:t>: documents requis par l'agent immigration</w:t>
+            </w:r>
           </w:p>
         </w:tc>
         <w:tc>
           <w:tcPr>
             <w:tcW w:w="5709" w:type="dxa"/>
+            <w:tcBorders>
+              <w:tl2br w:val="nil"/>
+              <w:tr2bl w:val="nil"/>
+            </w:tcBorders>
           </w:tcPr>
           <w:p>
             <w:pPr>
@@ -35364,6 +35870,7 @@
               <w:keepLines w:val="0"/>
               <w:widowControl/>
               <w:numPr>
+                <w:ilvl w:val="0"/>
                 <w:numId w:val="0"/>
               </w:numPr>
               <w:suppressLineNumbers w:val="0"/>
@@ -35382,27 +35889,188 @@
                 <w:lang w:val="fr-FR" w:eastAsia="zh-CN" w:bidi="ar"/>
               </w:rPr>
             </w:pPr>
+            <w:r>
+              <w:rPr>
+                <w:rFonts w:hint="default" w:ascii="Times New Roman" w:hAnsi="Times New Roman" w:eastAsia="SimSun" w:cs="Times New Roman"/>
+                <w:b/>
+                <w:bCs/>
+                <w:color w:val="000000"/>
+                <w:kern w:val="0"/>
+                <w:sz w:val="24"/>
+                <w:szCs w:val="24"/>
+                <w:u w:val="single"/>
+                <w:vertAlign w:val="baseline"/>
+                <w:lang w:val="fr-FR" w:eastAsia="zh-CN" w:bidi="ar"/>
+              </w:rPr>
+              <w:drawing>
+                <wp:inline distT="0" distB="0" distL="114300" distR="114300">
+                  <wp:extent cx="3573145" cy="1852930"/>
+                  <wp:effectExtent l="0" t="0" r="8255" b="6350"/>
+                  <wp:docPr id="60" name="Image 60" descr="CONFIRM REJET DEMANDE AGENT"/>
+                  <wp:cNvGraphicFramePr>
+                    <a:graphicFrameLocks xmlns:a="http://schemas.openxmlformats.org/drawingml/2006/main" noChangeAspect="1"/>
+                  </wp:cNvGraphicFramePr>
+                  <a:graphic xmlns:a="http://schemas.openxmlformats.org/drawingml/2006/main">
+                    <a:graphicData uri="http://schemas.openxmlformats.org/drawingml/2006/picture">
+                      <pic:pic xmlns:pic="http://schemas.openxmlformats.org/drawingml/2006/picture">
+                        <pic:nvPicPr>
+                          <pic:cNvPr id="60" name="Image 60" descr="CONFIRM REJET DEMANDE AGENT"/>
+                          <pic:cNvPicPr>
+                            <a:picLocks noChangeAspect="1"/>
+                          </pic:cNvPicPr>
+                        </pic:nvPicPr>
+                        <pic:blipFill>
+                          <a:blip r:embed="rId43"/>
+                          <a:stretch>
+                            <a:fillRect/>
+                          </a:stretch>
+                        </pic:blipFill>
+                        <pic:spPr>
+                          <a:xfrm>
+                            <a:off x="0" y="0"/>
+                            <a:ext cx="3573145" cy="1852930"/>
+                          </a:xfrm>
+                          <a:prstGeom prst="rect">
+                            <a:avLst/>
+                          </a:prstGeom>
+                        </pic:spPr>
+                      </pic:pic>
+                    </a:graphicData>
+                  </a:graphic>
+                </wp:inline>
+              </w:drawing>
+            </w:r>
+          </w:p>
+          <w:p>
+            <w:pPr>
+              <w:pStyle w:val="13"/>
+              <w:keepNext w:val="0"/>
+              <w:keepLines w:val="0"/>
+              <w:widowControl/>
+              <w:numPr>
+                <w:ilvl w:val="0"/>
+                <w:numId w:val="0"/>
+              </w:numPr>
+              <w:suppressLineNumbers w:val="0"/>
+              <w:spacing w:line="360" w:lineRule="auto"/>
+              <w:jc w:val="left"/>
+              <w:rPr>
+                <w:rFonts w:hint="default" w:ascii="Times New Roman" w:hAnsi="Times New Roman" w:eastAsia="SimSun" w:cs="Times New Roman"/>
+                <w:b/>
+                <w:bCs/>
+                <w:color w:val="000000"/>
+                <w:kern w:val="0"/>
+                <w:sz w:val="24"/>
+                <w:szCs w:val="24"/>
+                <w:u w:val="single"/>
+                <w:vertAlign w:val="baseline"/>
+                <w:lang w:val="fr-FR" w:eastAsia="zh-CN" w:bidi="ar"/>
+              </w:rPr>
+            </w:pPr>
+            <w:r>
+              <w:rPr>
+                <w:rFonts w:hint="default" w:ascii="Times New Roman" w:hAnsi="Times New Roman" w:cs="Times New Roman"/>
+                <w:b/>
+                <w:bCs/>
+                <w:sz w:val="24"/>
+                <w:szCs w:val="24"/>
+              </w:rPr>
+              <w:t xml:space="preserve">Figure </w:t>
+            </w:r>
+            <w:r>
+              <w:rPr>
+                <w:rFonts w:hint="default" w:ascii="Times New Roman" w:hAnsi="Times New Roman" w:cs="Times New Roman"/>
+                <w:b/>
+                <w:bCs/>
+                <w:sz w:val="24"/>
+                <w:szCs w:val="24"/>
+              </w:rPr>
+              <w:fldChar w:fldCharType="begin"/>
+            </w:r>
+            <w:r>
+              <w:rPr>
+                <w:rFonts w:hint="default" w:ascii="Times New Roman" w:hAnsi="Times New Roman" w:cs="Times New Roman"/>
+                <w:b/>
+                <w:bCs/>
+                <w:sz w:val="24"/>
+                <w:szCs w:val="24"/>
+              </w:rPr>
+              <w:instrText xml:space="preserve"> SEQ Figure \* ARABIC </w:instrText>
+            </w:r>
+            <w:r>
+              <w:rPr>
+                <w:rFonts w:hint="default" w:ascii="Times New Roman" w:hAnsi="Times New Roman" w:cs="Times New Roman"/>
+                <w:b/>
+                <w:bCs/>
+                <w:sz w:val="24"/>
+                <w:szCs w:val="24"/>
+              </w:rPr>
+              <w:fldChar w:fldCharType="separate"/>
+            </w:r>
+            <w:r>
+              <w:rPr>
+                <w:rFonts w:hint="default" w:ascii="Times New Roman" w:hAnsi="Times New Roman" w:cs="Times New Roman"/>
+                <w:b/>
+                <w:bCs/>
+                <w:sz w:val="24"/>
+                <w:szCs w:val="24"/>
+              </w:rPr>
+              <w:t>35</w:t>
+            </w:r>
+            <w:r>
+              <w:rPr>
+                <w:rFonts w:hint="default" w:ascii="Times New Roman" w:hAnsi="Times New Roman" w:cs="Times New Roman"/>
+                <w:b/>
+                <w:bCs/>
+                <w:sz w:val="24"/>
+                <w:szCs w:val="24"/>
+              </w:rPr>
+              <w:fldChar w:fldCharType="end"/>
+            </w:r>
+            <w:r>
+              <w:rPr>
+                <w:rFonts w:hint="default" w:ascii="Times New Roman" w:hAnsi="Times New Roman" w:cs="Times New Roman"/>
+                <w:b/>
+                <w:bCs/>
+                <w:sz w:val="24"/>
+                <w:szCs w:val="24"/>
+                <w:lang w:val="fr-FR"/>
+              </w:rPr>
+              <w:t>: motif de refus de demande visa par l'agent</w:t>
+            </w:r>
+            <w:r>
+              <w:rPr>
+                <w:lang w:val="fr-FR"/>
+              </w:rPr>
+              <w:t xml:space="preserve"> </w:t>
+            </w:r>
           </w:p>
         </w:tc>
       </w:tr>
       <w:tr>
         <w:tblPrEx>
           <w:tblBorders>
-            <w:top w:val="single" w:color="auto" w:sz="4" w:space="0"/>
-            <w:left w:val="single" w:color="auto" w:sz="4" w:space="0"/>
-            <w:bottom w:val="single" w:color="auto" w:sz="4" w:space="0"/>
-            <w:right w:val="single" w:color="auto" w:sz="4" w:space="0"/>
-            <w:insideH w:val="single" w:color="auto" w:sz="4" w:space="0"/>
-            <w:insideV w:val="single" w:color="auto" w:sz="4" w:space="0"/>
+            <w:top w:val="single" w:color="FFFFFF" w:themeColor="background1" w:sz="4" w:space="0"/>
+            <w:left w:val="single" w:color="FFFFFF" w:themeColor="background1" w:sz="4" w:space="0"/>
+            <w:bottom w:val="single" w:color="FFFFFF" w:themeColor="background1" w:sz="4" w:space="0"/>
+            <w:right w:val="single" w:color="FFFFFF" w:themeColor="background1" w:sz="4" w:space="0"/>
+            <w:insideH w:val="single" w:color="FFFFFF" w:themeColor="background1" w:sz="4" w:space="0"/>
+            <w:insideV w:val="single" w:color="FFFFFF" w:themeColor="background1" w:sz="4" w:space="0"/>
           </w:tblBorders>
           <w:tblCellMar>
+            <w:top w:w="0" w:type="dxa"/>
             <w:left w:w="108" w:type="dxa"/>
+            <w:bottom w:w="0" w:type="dxa"/>
             <w:right w:w="108" w:type="dxa"/>
           </w:tblCellMar>
         </w:tblPrEx>
         <w:tc>
           <w:tcPr>
             <w:tcW w:w="5740" w:type="dxa"/>
+            <w:tcBorders>
+              <w:tl2br w:val="nil"/>
+              <w:tr2bl w:val="nil"/>
+            </w:tcBorders>
           </w:tcPr>
           <w:p>
             <w:pPr>
@@ -35410,6 +36078,7 @@
               <w:keepLines w:val="0"/>
               <w:widowControl/>
               <w:numPr>
+                <w:ilvl w:val="0"/>
                 <w:numId w:val="0"/>
               </w:numPr>
               <w:suppressLineNumbers w:val="0"/>
@@ -35428,11 +36097,164 @@
                 <w:lang w:val="fr-FR" w:eastAsia="zh-CN" w:bidi="ar"/>
               </w:rPr>
             </w:pPr>
+            <w:r>
+              <w:rPr>
+                <w:rFonts w:hint="default" w:ascii="Times New Roman" w:hAnsi="Times New Roman" w:eastAsia="SimSun" w:cs="Times New Roman"/>
+                <w:b/>
+                <w:bCs/>
+                <w:color w:val="000000"/>
+                <w:kern w:val="0"/>
+                <w:sz w:val="24"/>
+                <w:szCs w:val="24"/>
+                <w:u w:val="single"/>
+                <w:vertAlign w:val="baseline"/>
+                <w:lang w:val="fr-FR" w:eastAsia="zh-CN" w:bidi="ar"/>
+              </w:rPr>
+              <w:drawing>
+                <wp:inline distT="0" distB="0" distL="114300" distR="114300">
+                  <wp:extent cx="3554730" cy="1697355"/>
+                  <wp:effectExtent l="0" t="0" r="11430" b="9525"/>
+                  <wp:docPr id="64" name="Image 64" descr="HISTORIQUE PAIEMENT AGENT"/>
+                  <wp:cNvGraphicFramePr>
+                    <a:graphicFrameLocks xmlns:a="http://schemas.openxmlformats.org/drawingml/2006/main" noChangeAspect="1"/>
+                  </wp:cNvGraphicFramePr>
+                  <a:graphic xmlns:a="http://schemas.openxmlformats.org/drawingml/2006/main">
+                    <a:graphicData uri="http://schemas.openxmlformats.org/drawingml/2006/picture">
+                      <pic:pic xmlns:pic="http://schemas.openxmlformats.org/drawingml/2006/picture">
+                        <pic:nvPicPr>
+                          <pic:cNvPr id="64" name="Image 64" descr="HISTORIQUE PAIEMENT AGENT"/>
+                          <pic:cNvPicPr>
+                            <a:picLocks noChangeAspect="1"/>
+                          </pic:cNvPicPr>
+                        </pic:nvPicPr>
+                        <pic:blipFill>
+                          <a:blip r:embed="rId44"/>
+                          <a:stretch>
+                            <a:fillRect/>
+                          </a:stretch>
+                        </pic:blipFill>
+                        <pic:spPr>
+                          <a:xfrm>
+                            <a:off x="0" y="0"/>
+                            <a:ext cx="3554730" cy="1697355"/>
+                          </a:xfrm>
+                          <a:prstGeom prst="rect">
+                            <a:avLst/>
+                          </a:prstGeom>
+                        </pic:spPr>
+                      </pic:pic>
+                    </a:graphicData>
+                  </a:graphic>
+                </wp:inline>
+              </w:drawing>
+            </w:r>
+          </w:p>
+          <w:p>
+            <w:pPr>
+              <w:pStyle w:val="13"/>
+              <w:keepNext w:val="0"/>
+              <w:keepLines w:val="0"/>
+              <w:widowControl/>
+              <w:numPr>
+                <w:ilvl w:val="0"/>
+                <w:numId w:val="0"/>
+              </w:numPr>
+              <w:suppressLineNumbers w:val="0"/>
+              <w:spacing w:line="360" w:lineRule="auto"/>
+              <w:jc w:val="left"/>
+              <w:rPr>
+                <w:rFonts w:hint="default" w:ascii="Times New Roman" w:hAnsi="Times New Roman" w:eastAsia="SimSun" w:cs="Times New Roman"/>
+                <w:b/>
+                <w:bCs/>
+                <w:color w:val="000000"/>
+                <w:kern w:val="0"/>
+                <w:sz w:val="24"/>
+                <w:szCs w:val="24"/>
+                <w:u w:val="single"/>
+                <w:vertAlign w:val="baseline"/>
+                <w:lang w:val="fr-FR" w:eastAsia="zh-CN" w:bidi="ar"/>
+              </w:rPr>
+            </w:pPr>
+            <w:r>
+              <w:rPr>
+                <w:rFonts w:hint="default" w:ascii="Times New Roman" w:hAnsi="Times New Roman" w:cs="Times New Roman"/>
+                <w:b/>
+                <w:bCs/>
+                <w:sz w:val="24"/>
+                <w:szCs w:val="24"/>
+              </w:rPr>
+              <w:t xml:space="preserve">Figure </w:t>
+            </w:r>
+            <w:r>
+              <w:rPr>
+                <w:rFonts w:hint="default" w:ascii="Times New Roman" w:hAnsi="Times New Roman" w:cs="Times New Roman"/>
+                <w:b/>
+                <w:bCs/>
+                <w:sz w:val="24"/>
+                <w:szCs w:val="24"/>
+              </w:rPr>
+              <w:fldChar w:fldCharType="begin"/>
+            </w:r>
+            <w:r>
+              <w:rPr>
+                <w:rFonts w:hint="default" w:ascii="Times New Roman" w:hAnsi="Times New Roman" w:cs="Times New Roman"/>
+                <w:b/>
+                <w:bCs/>
+                <w:sz w:val="24"/>
+                <w:szCs w:val="24"/>
+              </w:rPr>
+              <w:instrText xml:space="preserve"> SEQ Figure \* ARABIC </w:instrText>
+            </w:r>
+            <w:r>
+              <w:rPr>
+                <w:rFonts w:hint="default" w:ascii="Times New Roman" w:hAnsi="Times New Roman" w:cs="Times New Roman"/>
+                <w:b/>
+                <w:bCs/>
+                <w:sz w:val="24"/>
+                <w:szCs w:val="24"/>
+              </w:rPr>
+              <w:fldChar w:fldCharType="separate"/>
+            </w:r>
+            <w:r>
+              <w:rPr>
+                <w:rFonts w:hint="default" w:ascii="Times New Roman" w:hAnsi="Times New Roman" w:cs="Times New Roman"/>
+                <w:b/>
+                <w:bCs/>
+                <w:sz w:val="24"/>
+                <w:szCs w:val="24"/>
+              </w:rPr>
+              <w:t>36</w:t>
+            </w:r>
+            <w:r>
+              <w:rPr>
+                <w:rFonts w:hint="default" w:ascii="Times New Roman" w:hAnsi="Times New Roman" w:cs="Times New Roman"/>
+                <w:b/>
+                <w:bCs/>
+                <w:sz w:val="24"/>
+                <w:szCs w:val="24"/>
+              </w:rPr>
+              <w:fldChar w:fldCharType="end"/>
+            </w:r>
+            <w:r>
+              <w:rPr>
+                <w:rFonts w:hint="default" w:ascii="Times New Roman" w:hAnsi="Times New Roman" w:cs="Times New Roman"/>
+                <w:b/>
+                <w:bCs/>
+                <w:sz w:val="24"/>
+                <w:szCs w:val="24"/>
+                <w:lang w:val="fr-FR"/>
+              </w:rPr>
+              <w:t>: historique paiement des dossier par l'agent</w:t>
+            </w:r>
           </w:p>
         </w:tc>
         <w:tc>
           <w:tcPr>
             <w:tcW w:w="5709" w:type="dxa"/>
+            <w:tcBorders>
+              <w:tl2br w:val="nil"/>
+              <w:tr2bl w:val="nil"/>
+            </w:tcBorders>
           </w:tcPr>
           <w:p>
             <w:pPr>
@@ -35440,6 +36262,7 @@
               <w:keepLines w:val="0"/>
               <w:widowControl/>
               <w:numPr>
+                <w:ilvl w:val="0"/>
                 <w:numId w:val="0"/>
               </w:numPr>
               <w:suppressLineNumbers w:val="0"/>
@@ -35468,6 +36291,7 @@
         <w:keepLines w:val="0"/>
         <w:widowControl/>
         <w:numPr>
+          <w:ilvl w:val="0"/>
           <w:numId w:val="0"/>
         </w:numPr>
         <w:suppressLineNumbers w:val="0"/>
@@ -35533,6 +36357,7 @@
         <w:keepLines w:val="0"/>
         <w:widowControl/>
         <w:numPr>
+          <w:ilvl w:val="0"/>
           <w:numId w:val="0"/>
         </w:numPr>
         <w:suppressLineNumbers w:val="0"/>
@@ -35633,11 +36458,12 @@
           <w:szCs w:val="24"/>
           <w:lang w:val="fr-FR"/>
         </w:rPr>
-        <w:t>: captures besoins ambassade</w:t>
+        <w:t>: captures des besoins fonctionnels pour le module ambassade</w:t>
       </w:r>
     </w:p>
     <w:tbl>
       <w:tblPr>
+        <w:tblStyle w:val="17"/>
         <w:tblW w:w="11640" w:type="dxa"/>
         <w:tblInd w:w="-1493" w:type="dxa"/>
         <w:tblBorders>
@@ -35650,7 +36476,9 @@
         </w:tblBorders>
         <w:tblLayout w:type="autofit"/>
         <w:tblCellMar>
+          <w:top w:w="0" w:type="dxa"/>
           <w:left w:w="108" w:type="dxa"/>
+          <w:bottom w:w="0" w:type="dxa"/>
           <w:right w:w="108" w:type="dxa"/>
         </w:tblCellMar>
       </w:tblPr>
@@ -35669,7 +36497,9 @@
             <w:insideV w:val="none" w:color="auto" w:sz="0" w:space="0"/>
           </w:tblBorders>
           <w:tblCellMar>
+            <w:top w:w="0" w:type="dxa"/>
             <w:left w:w="108" w:type="dxa"/>
+            <w:bottom w:w="0" w:type="dxa"/>
             <w:right w:w="108" w:type="dxa"/>
           </w:tblCellMar>
         </w:tblPrEx>
@@ -35687,6 +36517,7 @@
               <w:keepLines w:val="0"/>
               <w:widowControl/>
               <w:numPr>
+                <w:ilvl w:val="0"/>
                 <w:numId w:val="0"/>
               </w:numPr>
               <w:suppressLineNumbers w:val="0"/>
@@ -35736,7 +36567,7 @@
                           </pic:cNvPicPr>
                         </pic:nvPicPr>
                         <pic:blipFill>
-                          <a:blip r:embed="rId40"/>
+                          <a:blip r:embed="rId45"/>
                           <a:stretch>
                             <a:fillRect/>
                           </a:stretch>
@@ -35764,6 +36595,7 @@
               <w:keepLines w:val="0"/>
               <w:widowControl/>
               <w:numPr>
+                <w:ilvl w:val="0"/>
                 <w:numId w:val="0"/>
               </w:numPr>
               <w:suppressLineNumbers w:val="0"/>
@@ -35830,7 +36662,7 @@
                 <w:sz w:val="24"/>
                 <w:szCs w:val="24"/>
               </w:rPr>
-              <w:t>32</w:t>
+              <w:t>37</w:t>
             </w:r>
             <w:r>
               <w:rPr>
@@ -35869,6 +36701,7 @@
               <w:keepLines w:val="0"/>
               <w:widowControl/>
               <w:numPr>
+                <w:ilvl w:val="0"/>
                 <w:numId w:val="0"/>
               </w:numPr>
               <w:suppressLineNumbers w:val="0"/>
@@ -35918,7 +36751,7 @@
                           </pic:cNvPicPr>
                         </pic:nvPicPr>
                         <pic:blipFill>
-                          <a:blip r:embed="rId41"/>
+                          <a:blip r:embed="rId46"/>
                           <a:stretch>
                             <a:fillRect/>
                           </a:stretch>
@@ -35946,6 +36779,7 @@
               <w:keepLines w:val="0"/>
               <w:widowControl/>
               <w:numPr>
+                <w:ilvl w:val="0"/>
                 <w:numId w:val="0"/>
               </w:numPr>
               <w:suppressLineNumbers w:val="0"/>
@@ -36012,7 +36846,7 @@
                 <w:sz w:val="18"/>
                 <w:szCs w:val="18"/>
               </w:rPr>
-              <w:t>33</w:t>
+              <w:t>38</w:t>
             </w:r>
             <w:r>
               <w:rPr>
@@ -36049,7 +36883,9 @@
             <w:insideV w:val="none" w:color="auto" w:sz="0" w:space="0"/>
           </w:tblBorders>
           <w:tblCellMar>
+            <w:top w:w="0" w:type="dxa"/>
             <w:left w:w="108" w:type="dxa"/>
+            <w:bottom w:w="0" w:type="dxa"/>
             <w:right w:w="108" w:type="dxa"/>
           </w:tblCellMar>
         </w:tblPrEx>
@@ -36067,6 +36903,7 @@
               <w:keepLines w:val="0"/>
               <w:widowControl/>
               <w:numPr>
+                <w:ilvl w:val="0"/>
                 <w:numId w:val="0"/>
               </w:numPr>
               <w:suppressLineNumbers w:val="0"/>
@@ -36116,7 +36953,7 @@
                           </pic:cNvPicPr>
                         </pic:nvPicPr>
                         <pic:blipFill>
-                          <a:blip r:embed="rId42"/>
+                          <a:blip r:embed="rId47"/>
                           <a:stretch>
                             <a:fillRect/>
                           </a:stretch>
@@ -36144,6 +36981,7 @@
               <w:keepLines w:val="0"/>
               <w:widowControl/>
               <w:numPr>
+                <w:ilvl w:val="0"/>
                 <w:numId w:val="0"/>
               </w:numPr>
               <w:suppressLineNumbers w:val="0"/>
@@ -36210,7 +37048,7 @@
                 <w:sz w:val="24"/>
                 <w:szCs w:val="24"/>
               </w:rPr>
-              <w:t>34</w:t>
+              <w:t>39</w:t>
             </w:r>
             <w:r>
               <w:rPr>
@@ -36249,6 +37087,7 @@
               <w:keepLines w:val="0"/>
               <w:widowControl/>
               <w:numPr>
+                <w:ilvl w:val="0"/>
                 <w:numId w:val="0"/>
               </w:numPr>
               <w:suppressLineNumbers w:val="0"/>
@@ -36298,7 +37137,7 @@
                           </pic:cNvPicPr>
                         </pic:nvPicPr>
                         <pic:blipFill>
-                          <a:blip r:embed="rId43"/>
+                          <a:blip r:embed="rId48"/>
                           <a:stretch>
                             <a:fillRect/>
                           </a:stretch>
@@ -36326,6 +37165,7 @@
               <w:keepLines w:val="0"/>
               <w:widowControl/>
               <w:numPr>
+                <w:ilvl w:val="0"/>
                 <w:numId w:val="0"/>
               </w:numPr>
               <w:suppressLineNumbers w:val="0"/>
@@ -36392,7 +37232,7 @@
                 <w:sz w:val="24"/>
                 <w:szCs w:val="24"/>
               </w:rPr>
-              <w:t>35</w:t>
+              <w:t>40</w:t>
             </w:r>
             <w:r>
               <w:rPr>
@@ -36413,7 +37253,7 @@
                 <w:szCs w:val="24"/>
                 <w:lang w:val="fr-FR"/>
               </w:rPr>
-              <w:t>: raison du refus de visa par ambassade</w:t>
+              <w:t>: raisons du refus de visa par ambassade</w:t>
             </w:r>
           </w:p>
         </w:tc>
@@ -36429,7 +37269,9 @@
             <w:insideV w:val="none" w:color="auto" w:sz="0" w:space="0"/>
           </w:tblBorders>
           <w:tblCellMar>
+            <w:top w:w="0" w:type="dxa"/>
             <w:left w:w="108" w:type="dxa"/>
+            <w:bottom w:w="0" w:type="dxa"/>
             <w:right w:w="108" w:type="dxa"/>
           </w:tblCellMar>
         </w:tblPrEx>
@@ -36451,6 +37293,7 @@
               <w:keepLines w:val="0"/>
               <w:widowControl/>
               <w:numPr>
+                <w:ilvl w:val="0"/>
                 <w:numId w:val="0"/>
               </w:numPr>
               <w:suppressLineNumbers w:val="0"/>
@@ -36500,7 +37343,7 @@
                           </pic:cNvPicPr>
                         </pic:nvPicPr>
                         <pic:blipFill>
-                          <a:blip r:embed="rId44"/>
+                          <a:blip r:embed="rId49"/>
                           <a:stretch>
                             <a:fillRect/>
                           </a:stretch>
@@ -36528,6 +37371,7 @@
               <w:keepLines w:val="0"/>
               <w:widowControl/>
               <w:numPr>
+                <w:ilvl w:val="0"/>
                 <w:numId w:val="0"/>
               </w:numPr>
               <w:suppressLineNumbers w:val="0"/>
@@ -36594,7 +37438,7 @@
                 <w:sz w:val="24"/>
                 <w:szCs w:val="24"/>
               </w:rPr>
-              <w:t>36</w:t>
+              <w:t>41</w:t>
             </w:r>
             <w:r>
               <w:rPr>
@@ -36627,6 +37471,7 @@
         <w:keepLines w:val="0"/>
         <w:widowControl/>
         <w:numPr>
+          <w:ilvl w:val="0"/>
           <w:numId w:val="0"/>
         </w:numPr>
         <w:suppressLineNumbers w:val="0"/>
@@ -36767,11 +37612,12 @@
           <w:szCs w:val="24"/>
           <w:lang w:val="fr-FR"/>
         </w:rPr>
-        <w:t>: captures besoins agent contrôle aux frontières</w:t>
+        <w:t>: captures besoins fonctionnels pou le module agent contrôle aux frontières</w:t>
       </w:r>
     </w:p>
     <w:tbl>
       <w:tblPr>
+        <w:tblStyle w:val="17"/>
         <w:tblW w:w="11443" w:type="dxa"/>
         <w:tblInd w:w="-1471" w:type="dxa"/>
         <w:tblBorders>
@@ -36784,7 +37630,9 @@
         </w:tblBorders>
         <w:tblLayout w:type="fixed"/>
         <w:tblCellMar>
+          <w:top w:w="0" w:type="dxa"/>
           <w:left w:w="108" w:type="dxa"/>
+          <w:bottom w:w="0" w:type="dxa"/>
           <w:right w:w="108" w:type="dxa"/>
         </w:tblCellMar>
       </w:tblPr>
@@ -36803,7 +37651,9 @@
             <w:insideV w:val="none" w:color="auto" w:sz="0" w:space="0"/>
           </w:tblBorders>
           <w:tblCellMar>
+            <w:top w:w="0" w:type="dxa"/>
             <w:left w:w="108" w:type="dxa"/>
+            <w:bottom w:w="0" w:type="dxa"/>
             <w:right w:w="108" w:type="dxa"/>
           </w:tblCellMar>
         </w:tblPrEx>
@@ -36821,6 +37671,7 @@
               <w:keepLines w:val="0"/>
               <w:widowControl/>
               <w:numPr>
+                <w:ilvl w:val="0"/>
                 <w:numId w:val="0"/>
               </w:numPr>
               <w:suppressLineNumbers w:val="0"/>
@@ -36870,7 +37721,7 @@
                           </pic:cNvPicPr>
                         </pic:nvPicPr>
                         <pic:blipFill>
-                          <a:blip r:embed="rId45"/>
+                          <a:blip r:embed="rId50"/>
                           <a:stretch>
                             <a:fillRect/>
                           </a:stretch>
@@ -36898,6 +37749,7 @@
               <w:keepLines w:val="0"/>
               <w:widowControl/>
               <w:numPr>
+                <w:ilvl w:val="0"/>
                 <w:numId w:val="0"/>
               </w:numPr>
               <w:suppressLineNumbers w:val="0"/>
@@ -36964,7 +37816,7 @@
                 <w:sz w:val="22"/>
                 <w:szCs w:val="22"/>
               </w:rPr>
-              <w:t>37</w:t>
+              <w:t>42</w:t>
             </w:r>
             <w:r>
               <w:rPr>
@@ -37003,6 +37855,7 @@
               <w:keepLines w:val="0"/>
               <w:widowControl/>
               <w:numPr>
+                <w:ilvl w:val="0"/>
                 <w:numId w:val="0"/>
               </w:numPr>
               <w:suppressLineNumbers w:val="0"/>
@@ -37052,7 +37905,7 @@
                           </pic:cNvPicPr>
                         </pic:nvPicPr>
                         <pic:blipFill>
-                          <a:blip r:embed="rId46"/>
+                          <a:blip r:embed="rId51"/>
                           <a:stretch>
                             <a:fillRect/>
                           </a:stretch>
@@ -37080,6 +37933,7 @@
               <w:keepLines w:val="0"/>
               <w:widowControl/>
               <w:numPr>
+                <w:ilvl w:val="0"/>
                 <w:numId w:val="0"/>
               </w:numPr>
               <w:suppressLineNumbers w:val="0"/>
@@ -37146,7 +38000,7 @@
                 <w:sz w:val="24"/>
                 <w:szCs w:val="24"/>
               </w:rPr>
-              <w:t>38</w:t>
+              <w:t>43</w:t>
             </w:r>
             <w:r>
               <w:rPr>
@@ -37183,7 +38037,9 @@
             <w:insideV w:val="none" w:color="auto" w:sz="0" w:space="0"/>
           </w:tblBorders>
           <w:tblCellMar>
+            <w:top w:w="0" w:type="dxa"/>
             <w:left w:w="108" w:type="dxa"/>
+            <w:bottom w:w="0" w:type="dxa"/>
             <w:right w:w="108" w:type="dxa"/>
           </w:tblCellMar>
         </w:tblPrEx>
@@ -37201,6 +38057,7 @@
               <w:keepLines w:val="0"/>
               <w:widowControl/>
               <w:numPr>
+                <w:ilvl w:val="0"/>
                 <w:numId w:val="0"/>
               </w:numPr>
               <w:suppressLineNumbers w:val="0"/>
@@ -37250,7 +38107,7 @@
                           </pic:cNvPicPr>
                         </pic:nvPicPr>
                         <pic:blipFill>
-                          <a:blip r:embed="rId47"/>
+                          <a:blip r:embed="rId52"/>
                           <a:stretch>
                             <a:fillRect/>
                           </a:stretch>
@@ -37278,6 +38135,7 @@
               <w:keepLines w:val="0"/>
               <w:widowControl/>
               <w:numPr>
+                <w:ilvl w:val="0"/>
                 <w:numId w:val="0"/>
               </w:numPr>
               <w:suppressLineNumbers w:val="0"/>
@@ -37344,7 +38202,7 @@
                 <w:sz w:val="24"/>
                 <w:szCs w:val="24"/>
               </w:rPr>
-              <w:t>39</w:t>
+              <w:t>44</w:t>
             </w:r>
             <w:r>
               <w:rPr>
@@ -37383,6 +38241,7 @@
               <w:keepLines w:val="0"/>
               <w:widowControl/>
               <w:numPr>
+                <w:ilvl w:val="0"/>
                 <w:numId w:val="0"/>
               </w:numPr>
               <w:suppressLineNumbers w:val="0"/>
@@ -37432,7 +38291,7 @@
                           </pic:cNvPicPr>
                         </pic:nvPicPr>
                         <pic:blipFill>
-                          <a:blip r:embed="rId48"/>
+                          <a:blip r:embed="rId53"/>
                           <a:stretch>
                             <a:fillRect/>
                           </a:stretch>
@@ -37460,6 +38319,7 @@
               <w:keepLines w:val="0"/>
               <w:widowControl/>
               <w:numPr>
+                <w:ilvl w:val="0"/>
                 <w:numId w:val="0"/>
               </w:numPr>
               <w:suppressLineNumbers w:val="0"/>
@@ -37526,7 +38386,7 @@
                 <w:sz w:val="24"/>
                 <w:szCs w:val="24"/>
               </w:rPr>
-              <w:t>40</w:t>
+              <w:t>45</w:t>
             </w:r>
             <w:r>
               <w:rPr>
@@ -37802,6 +38662,7 @@
     </w:p>
     <w:tbl>
       <w:tblPr>
+        <w:tblStyle w:val="17"/>
         <w:tblW w:w="9655" w:type="dxa"/>
         <w:tblInd w:w="0" w:type="dxa"/>
         <w:tblBorders>
@@ -37814,7 +38675,9 @@
         </w:tblBorders>
         <w:tblLayout w:type="autofit"/>
         <w:tblCellMar>
+          <w:top w:w="0" w:type="dxa"/>
           <w:left w:w="108" w:type="dxa"/>
+          <w:bottom w:w="0" w:type="dxa"/>
           <w:right w:w="108" w:type="dxa"/>
         </w:tblCellMar>
       </w:tblPr>
@@ -37834,7 +38697,9 @@
             <w:insideV w:val="single" w:color="auto" w:sz="4" w:space="0"/>
           </w:tblBorders>
           <w:tblCellMar>
+            <w:top w:w="0" w:type="dxa"/>
             <w:left w:w="108" w:type="dxa"/>
+            <w:bottom w:w="0" w:type="dxa"/>
             <w:right w:w="108" w:type="dxa"/>
           </w:tblCellMar>
         </w:tblPrEx>
@@ -37947,7 +38812,9 @@
             <w:insideV w:val="single" w:color="auto" w:sz="4" w:space="0"/>
           </w:tblBorders>
           <w:tblCellMar>
+            <w:top w:w="0" w:type="dxa"/>
             <w:left w:w="108" w:type="dxa"/>
+            <w:bottom w:w="0" w:type="dxa"/>
             <w:right w:w="108" w:type="dxa"/>
           </w:tblCellMar>
         </w:tblPrEx>
@@ -38048,7 +38915,9 @@
             <w:insideV w:val="single" w:color="auto" w:sz="4" w:space="0"/>
           </w:tblBorders>
           <w:tblCellMar>
+            <w:top w:w="0" w:type="dxa"/>
             <w:left w:w="108" w:type="dxa"/>
+            <w:bottom w:w="0" w:type="dxa"/>
             <w:right w:w="108" w:type="dxa"/>
           </w:tblCellMar>
         </w:tblPrEx>
@@ -38154,7 +39023,9 @@
             <w:insideV w:val="single" w:color="auto" w:sz="4" w:space="0"/>
           </w:tblBorders>
           <w:tblCellMar>
+            <w:top w:w="0" w:type="dxa"/>
             <w:left w:w="108" w:type="dxa"/>
+            <w:bottom w:w="0" w:type="dxa"/>
             <w:right w:w="108" w:type="dxa"/>
           </w:tblCellMar>
         </w:tblPrEx>
@@ -38257,7 +39128,9 @@
             <w:insideV w:val="single" w:color="auto" w:sz="4" w:space="0"/>
           </w:tblBorders>
           <w:tblCellMar>
+            <w:top w:w="0" w:type="dxa"/>
             <w:left w:w="108" w:type="dxa"/>
+            <w:bottom w:w="0" w:type="dxa"/>
             <w:right w:w="108" w:type="dxa"/>
           </w:tblCellMar>
         </w:tblPrEx>
@@ -38361,7 +39234,9 @@
             <w:insideV w:val="single" w:color="auto" w:sz="4" w:space="0"/>
           </w:tblBorders>
           <w:tblCellMar>
+            <w:top w:w="0" w:type="dxa"/>
             <w:left w:w="108" w:type="dxa"/>
+            <w:bottom w:w="0" w:type="dxa"/>
             <w:right w:w="108" w:type="dxa"/>
           </w:tblCellMar>
         </w:tblPrEx>
@@ -38462,7 +39337,9 @@
             <w:insideV w:val="single" w:color="auto" w:sz="4" w:space="0"/>
           </w:tblBorders>
           <w:tblCellMar>
+            <w:top w:w="0" w:type="dxa"/>
             <w:left w:w="108" w:type="dxa"/>
+            <w:bottom w:w="0" w:type="dxa"/>
             <w:right w:w="108" w:type="dxa"/>
           </w:tblCellMar>
         </w:tblPrEx>
@@ -38566,7 +39443,9 @@
             <w:insideV w:val="single" w:color="auto" w:sz="4" w:space="0"/>
           </w:tblBorders>
           <w:tblCellMar>
+            <w:top w:w="0" w:type="dxa"/>
             <w:left w:w="108" w:type="dxa"/>
+            <w:bottom w:w="0" w:type="dxa"/>
             <w:right w:w="108" w:type="dxa"/>
           </w:tblCellMar>
         </w:tblPrEx>
@@ -38725,7 +39604,9 @@
             <w:insideV w:val="single" w:color="auto" w:sz="4" w:space="0"/>
           </w:tblBorders>
           <w:tblCellMar>
+            <w:top w:w="0" w:type="dxa"/>
             <w:left w:w="108" w:type="dxa"/>
+            <w:bottom w:w="0" w:type="dxa"/>
             <w:right w:w="108" w:type="dxa"/>
           </w:tblCellMar>
         </w:tblPrEx>
@@ -38826,7 +39707,9 @@
             <w:insideV w:val="single" w:color="auto" w:sz="4" w:space="0"/>
           </w:tblBorders>
           <w:tblCellMar>
+            <w:top w:w="0" w:type="dxa"/>
             <w:left w:w="108" w:type="dxa"/>
+            <w:bottom w:w="0" w:type="dxa"/>
             <w:right w:w="108" w:type="dxa"/>
           </w:tblCellMar>
         </w:tblPrEx>
@@ -38926,7 +39809,7 @@
           <w:rFonts w:hint="default" w:ascii="Times New Roman" w:hAnsi="Times New Roman" w:cs="Times New Roman"/>
           <w:lang w:val="fr-FR"/>
         </w:rPr>
-        <w:t>Ressources materielles du projet</w:t>
+        <w:t>Ressources matérielles du projet</w:t>
       </w:r>
     </w:p>
     <w:p>
@@ -39118,6 +40001,7 @@
     </w:p>
     <w:tbl>
       <w:tblPr>
+        <w:tblStyle w:val="17"/>
         <w:tblW w:w="10164" w:type="dxa"/>
         <w:tblInd w:w="-485" w:type="dxa"/>
         <w:tblBorders>
@@ -39130,7 +40014,9 @@
         </w:tblBorders>
         <w:tblLayout w:type="fixed"/>
         <w:tblCellMar>
+          <w:top w:w="0" w:type="dxa"/>
           <w:left w:w="108" w:type="dxa"/>
+          <w:bottom w:w="0" w:type="dxa"/>
           <w:right w:w="108" w:type="dxa"/>
         </w:tblCellMar>
       </w:tblPr>
@@ -39151,6 +40037,12 @@
             <w:insideH w:val="single" w:color="auto" w:sz="4" w:space="0"/>
             <w:insideV w:val="single" w:color="auto" w:sz="4" w:space="0"/>
           </w:tblBorders>
+          <w:tblCellMar>
+            <w:top w:w="0" w:type="dxa"/>
+            <w:left w:w="108" w:type="dxa"/>
+            <w:bottom w:w="0" w:type="dxa"/>
+            <w:right w:w="108" w:type="dxa"/>
+          </w:tblCellMar>
         </w:tblPrEx>
         <w:trPr>
           <w:trHeight w:val="902" w:hRule="atLeast"/>
@@ -39369,7 +40261,9 @@
             <w:insideV w:val="single" w:color="auto" w:sz="4" w:space="0"/>
           </w:tblBorders>
           <w:tblCellMar>
+            <w:top w:w="0" w:type="dxa"/>
             <w:left w:w="108" w:type="dxa"/>
+            <w:bottom w:w="0" w:type="dxa"/>
             <w:right w:w="108" w:type="dxa"/>
           </w:tblCellMar>
         </w:tblPrEx>
@@ -39676,7 +40570,9 @@
             <w:insideV w:val="single" w:color="auto" w:sz="4" w:space="0"/>
           </w:tblBorders>
           <w:tblCellMar>
+            <w:top w:w="0" w:type="dxa"/>
             <w:left w:w="108" w:type="dxa"/>
+            <w:bottom w:w="0" w:type="dxa"/>
             <w:right w:w="108" w:type="dxa"/>
           </w:tblCellMar>
         </w:tblPrEx>
@@ -39894,7 +40790,9 @@
             <w:insideV w:val="single" w:color="auto" w:sz="4" w:space="0"/>
           </w:tblBorders>
           <w:tblCellMar>
+            <w:top w:w="0" w:type="dxa"/>
             <w:left w:w="108" w:type="dxa"/>
+            <w:bottom w:w="0" w:type="dxa"/>
             <w:right w:w="108" w:type="dxa"/>
           </w:tblCellMar>
         </w:tblPrEx>
@@ -40107,7 +41005,9 @@
             <w:insideV w:val="single" w:color="auto" w:sz="4" w:space="0"/>
           </w:tblBorders>
           <w:tblCellMar>
+            <w:top w:w="0" w:type="dxa"/>
             <w:left w:w="108" w:type="dxa"/>
+            <w:bottom w:w="0" w:type="dxa"/>
             <w:right w:w="108" w:type="dxa"/>
           </w:tblCellMar>
         </w:tblPrEx>
@@ -40325,7 +41225,9 @@
             <w:insideV w:val="single" w:color="auto" w:sz="4" w:space="0"/>
           </w:tblBorders>
           <w:tblCellMar>
+            <w:top w:w="0" w:type="dxa"/>
             <w:left w:w="108" w:type="dxa"/>
+            <w:bottom w:w="0" w:type="dxa"/>
             <w:right w:w="108" w:type="dxa"/>
           </w:tblCellMar>
         </w:tblPrEx>
@@ -40538,7 +41440,9 @@
             <w:insideV w:val="single" w:color="auto" w:sz="4" w:space="0"/>
           </w:tblBorders>
           <w:tblCellMar>
+            <w:top w:w="0" w:type="dxa"/>
             <w:left w:w="108" w:type="dxa"/>
+            <w:bottom w:w="0" w:type="dxa"/>
             <w:right w:w="108" w:type="dxa"/>
           </w:tblCellMar>
         </w:tblPrEx>
@@ -40849,6 +41753,7 @@
     </w:p>
     <w:tbl>
       <w:tblPr>
+        <w:tblStyle w:val="17"/>
         <w:tblW w:w="9475" w:type="dxa"/>
         <w:tblInd w:w="0" w:type="dxa"/>
         <w:tblBorders>
@@ -40861,7 +41766,9 @@
         </w:tblBorders>
         <w:tblLayout w:type="fixed"/>
         <w:tblCellMar>
+          <w:top w:w="0" w:type="dxa"/>
           <w:left w:w="108" w:type="dxa"/>
+          <w:bottom w:w="0" w:type="dxa"/>
           <w:right w:w="108" w:type="dxa"/>
         </w:tblCellMar>
       </w:tblPr>
@@ -40885,7 +41792,9 @@
             <w:insideV w:val="single" w:color="auto" w:sz="4" w:space="0"/>
           </w:tblBorders>
           <w:tblCellMar>
+            <w:top w:w="0" w:type="dxa"/>
             <w:left w:w="108" w:type="dxa"/>
+            <w:bottom w:w="0" w:type="dxa"/>
             <w:right w:w="108" w:type="dxa"/>
           </w:tblCellMar>
         </w:tblPrEx>
@@ -41100,7 +42009,9 @@
             <w:insideV w:val="single" w:color="auto" w:sz="4" w:space="0"/>
           </w:tblBorders>
           <w:tblCellMar>
+            <w:top w:w="0" w:type="dxa"/>
             <w:left w:w="108" w:type="dxa"/>
+            <w:bottom w:w="0" w:type="dxa"/>
             <w:right w:w="108" w:type="dxa"/>
           </w:tblCellMar>
         </w:tblPrEx>
@@ -41287,7 +42198,9 @@
             <w:insideV w:val="single" w:color="auto" w:sz="4" w:space="0"/>
           </w:tblBorders>
           <w:tblCellMar>
+            <w:top w:w="0" w:type="dxa"/>
             <w:left w:w="108" w:type="dxa"/>
+            <w:bottom w:w="0" w:type="dxa"/>
             <w:right w:w="108" w:type="dxa"/>
           </w:tblCellMar>
         </w:tblPrEx>
@@ -41480,7 +42393,9 @@
             <w:insideV w:val="single" w:color="auto" w:sz="4" w:space="0"/>
           </w:tblBorders>
           <w:tblCellMar>
+            <w:top w:w="0" w:type="dxa"/>
             <w:left w:w="108" w:type="dxa"/>
+            <w:bottom w:w="0" w:type="dxa"/>
             <w:right w:w="108" w:type="dxa"/>
           </w:tblCellMar>
         </w:tblPrEx>
@@ -41667,7 +42582,9 @@
             <w:insideV w:val="single" w:color="auto" w:sz="4" w:space="0"/>
           </w:tblBorders>
           <w:tblCellMar>
+            <w:top w:w="0" w:type="dxa"/>
             <w:left w:w="108" w:type="dxa"/>
+            <w:bottom w:w="0" w:type="dxa"/>
             <w:right w:w="108" w:type="dxa"/>
           </w:tblCellMar>
         </w:tblPrEx>
@@ -41860,7 +42777,9 @@
             <w:insideV w:val="single" w:color="auto" w:sz="4" w:space="0"/>
           </w:tblBorders>
           <w:tblCellMar>
+            <w:top w:w="0" w:type="dxa"/>
             <w:left w:w="108" w:type="dxa"/>
+            <w:bottom w:w="0" w:type="dxa"/>
             <w:right w:w="108" w:type="dxa"/>
           </w:tblCellMar>
         </w:tblPrEx>
@@ -41941,14 +42860,6 @@
     </w:p>
     <w:p>
       <w:pPr>
-        <w:rPr>
-          <w:rFonts w:hint="default"/>
-          <w:lang w:val="fr-FR"/>
-        </w:rPr>
-      </w:pPr>
-    </w:p>
-    <w:p>
-      <w:pPr>
         <w:pStyle w:val="4"/>
         <w:numPr>
           <w:ilvl w:val="0"/>
@@ -42141,6 +43052,7 @@
     </w:p>
     <w:tbl>
       <w:tblPr>
+        <w:tblStyle w:val="17"/>
         <w:tblW w:w="0" w:type="auto"/>
         <w:tblInd w:w="0" w:type="dxa"/>
         <w:tblBorders>
@@ -42153,7 +43065,9 @@
         </w:tblBorders>
         <w:tblLayout w:type="autofit"/>
         <w:tblCellMar>
+          <w:top w:w="0" w:type="dxa"/>
           <w:left w:w="108" w:type="dxa"/>
+          <w:bottom w:w="0" w:type="dxa"/>
           <w:right w:w="108" w:type="dxa"/>
         </w:tblCellMar>
       </w:tblPr>
@@ -42172,7 +43086,9 @@
             <w:insideV w:val="single" w:color="auto" w:sz="4" w:space="0"/>
           </w:tblBorders>
           <w:tblCellMar>
+            <w:top w:w="0" w:type="dxa"/>
             <w:left w:w="108" w:type="dxa"/>
+            <w:bottom w:w="0" w:type="dxa"/>
             <w:right w:w="108" w:type="dxa"/>
           </w:tblCellMar>
         </w:tblPrEx>
@@ -42254,7 +43170,9 @@
             <w:insideV w:val="single" w:color="auto" w:sz="4" w:space="0"/>
           </w:tblBorders>
           <w:tblCellMar>
+            <w:top w:w="0" w:type="dxa"/>
             <w:left w:w="108" w:type="dxa"/>
+            <w:bottom w:w="0" w:type="dxa"/>
             <w:right w:w="108" w:type="dxa"/>
           </w:tblCellMar>
         </w:tblPrEx>
@@ -42328,7 +43246,9 @@
             <w:insideV w:val="single" w:color="auto" w:sz="4" w:space="0"/>
           </w:tblBorders>
           <w:tblCellMar>
+            <w:top w:w="0" w:type="dxa"/>
             <w:left w:w="108" w:type="dxa"/>
+            <w:bottom w:w="0" w:type="dxa"/>
             <w:right w:w="108" w:type="dxa"/>
           </w:tblCellMar>
         </w:tblPrEx>
@@ -42404,7 +43324,9 @@
             <w:insideV w:val="single" w:color="auto" w:sz="4" w:space="0"/>
           </w:tblBorders>
           <w:tblCellMar>
+            <w:top w:w="0" w:type="dxa"/>
             <w:left w:w="108" w:type="dxa"/>
+            <w:bottom w:w="0" w:type="dxa"/>
             <w:right w:w="108" w:type="dxa"/>
           </w:tblCellMar>
         </w:tblPrEx>
@@ -42478,7 +43400,9 @@
             <w:insideV w:val="single" w:color="auto" w:sz="4" w:space="0"/>
           </w:tblBorders>
           <w:tblCellMar>
+            <w:top w:w="0" w:type="dxa"/>
             <w:left w:w="108" w:type="dxa"/>
+            <w:bottom w:w="0" w:type="dxa"/>
             <w:right w:w="108" w:type="dxa"/>
           </w:tblCellMar>
         </w:tblPrEx>
@@ -42554,7 +43478,9 @@
             <w:insideV w:val="single" w:color="auto" w:sz="4" w:space="0"/>
           </w:tblBorders>
           <w:tblCellMar>
+            <w:top w:w="0" w:type="dxa"/>
             <w:left w:w="108" w:type="dxa"/>
+            <w:bottom w:w="0" w:type="dxa"/>
             <w:right w:w="108" w:type="dxa"/>
           </w:tblCellMar>
         </w:tblPrEx>
@@ -42800,97 +43726,8 @@
           <w:lang w:val="fr-FR"/>
         </w:rPr>
       </w:pPr>
-    </w:p>
-    <w:p>
-      <w:pPr>
-        <w:numPr>
-          <w:ilvl w:val="0"/>
-          <w:numId w:val="0"/>
-        </w:numPr>
-        <w:ind w:leftChars="0"/>
-        <w:rPr>
-          <w:rFonts w:hint="default"/>
-          <w:lang w:val="fr-FR"/>
-        </w:rPr>
-      </w:pPr>
-    </w:p>
-    <w:p>
-      <w:pPr>
-        <w:numPr>
-          <w:ilvl w:val="0"/>
-          <w:numId w:val="0"/>
-        </w:numPr>
-        <w:ind w:leftChars="0"/>
-        <w:rPr>
-          <w:rFonts w:hint="default"/>
-          <w:lang w:val="fr-FR"/>
-        </w:rPr>
-      </w:pPr>
-    </w:p>
-    <w:p>
-      <w:pPr>
-        <w:numPr>
-          <w:ilvl w:val="0"/>
-          <w:numId w:val="0"/>
-        </w:numPr>
-        <w:ind w:leftChars="0"/>
-        <w:rPr>
-          <w:rFonts w:hint="default"/>
-          <w:lang w:val="fr-FR"/>
-        </w:rPr>
-      </w:pPr>
-    </w:p>
-    <w:p>
-      <w:pPr>
-        <w:numPr>
-          <w:ilvl w:val="0"/>
-          <w:numId w:val="0"/>
-        </w:numPr>
-        <w:ind w:leftChars="0"/>
-        <w:rPr>
-          <w:rFonts w:hint="default"/>
-          <w:lang w:val="fr-FR"/>
-        </w:rPr>
-      </w:pPr>
-    </w:p>
-    <w:p>
-      <w:pPr>
-        <w:numPr>
-          <w:ilvl w:val="0"/>
-          <w:numId w:val="0"/>
-        </w:numPr>
-        <w:ind w:leftChars="0"/>
-        <w:rPr>
-          <w:rFonts w:hint="default"/>
-          <w:lang w:val="fr-FR"/>
-        </w:rPr>
-      </w:pPr>
-    </w:p>
-    <w:p>
-      <w:pPr>
-        <w:numPr>
-          <w:ilvl w:val="0"/>
-          <w:numId w:val="0"/>
-        </w:numPr>
-        <w:ind w:leftChars="0"/>
-        <w:rPr>
-          <w:rFonts w:hint="default"/>
-          <w:lang w:val="fr-FR"/>
-        </w:rPr>
-      </w:pPr>
-    </w:p>
-    <w:p>
-      <w:pPr>
-        <w:numPr>
-          <w:ilvl w:val="0"/>
-          <w:numId w:val="0"/>
-        </w:numPr>
-        <w:ind w:leftChars="0"/>
-        <w:rPr>
-          <w:rFonts w:hint="default"/>
-          <w:lang w:val="fr-FR"/>
-        </w:rPr>
-      </w:pPr>
+      <w:bookmarkStart w:id="0" w:name="_GoBack"/>
+      <w:bookmarkEnd w:id="0"/>
     </w:p>
     <w:p>
       <w:pPr>
@@ -43079,122 +43916,6 @@
         </w:numPr>
         <w:spacing w:line="360" w:lineRule="auto"/>
         <w:ind w:leftChars="0"/>
-        <w:rPr>
-          <w:rFonts w:hint="default" w:ascii="Times New Roman" w:hAnsi="Times New Roman" w:cs="Times New Roman"/>
-          <w:sz w:val="24"/>
-          <w:szCs w:val="24"/>
-          <w:lang w:val="fr-FR"/>
-        </w:rPr>
-      </w:pPr>
-    </w:p>
-    <w:p>
-      <w:pPr>
-        <w:rPr>
-          <w:rFonts w:hint="default"/>
-          <w:lang w:val="fr-FR"/>
-        </w:rPr>
-      </w:pPr>
-    </w:p>
-    <w:p>
-      <w:pPr>
-        <w:rPr>
-          <w:rFonts w:hint="default"/>
-          <w:lang w:val="fr-FR"/>
-        </w:rPr>
-      </w:pPr>
-    </w:p>
-    <w:p>
-      <w:pPr>
-        <w:rPr>
-          <w:rFonts w:hint="default" w:ascii="Times New Roman" w:hAnsi="Times New Roman" w:cs="Times New Roman"/>
-          <w:sz w:val="24"/>
-          <w:szCs w:val="24"/>
-          <w:lang w:val="fr-FR"/>
-        </w:rPr>
-      </w:pPr>
-    </w:p>
-    <w:p>
-      <w:pPr>
-        <w:rPr>
-          <w:rFonts w:hint="default" w:ascii="Times New Roman" w:hAnsi="Times New Roman" w:cs="Times New Roman"/>
-          <w:sz w:val="24"/>
-          <w:szCs w:val="24"/>
-          <w:lang w:val="fr-FR"/>
-        </w:rPr>
-      </w:pPr>
-    </w:p>
-    <w:p>
-      <w:pPr>
-        <w:rPr>
-          <w:rFonts w:hint="default" w:ascii="Times New Roman" w:hAnsi="Times New Roman" w:cs="Times New Roman"/>
-          <w:sz w:val="24"/>
-          <w:szCs w:val="24"/>
-          <w:lang w:val="fr-FR"/>
-        </w:rPr>
-      </w:pPr>
-    </w:p>
-    <w:p>
-      <w:pPr>
-        <w:rPr>
-          <w:rFonts w:hint="default" w:ascii="Times New Roman" w:hAnsi="Times New Roman" w:cs="Times New Roman"/>
-          <w:sz w:val="24"/>
-          <w:szCs w:val="24"/>
-          <w:lang w:val="fr-FR"/>
-        </w:rPr>
-      </w:pPr>
-    </w:p>
-    <w:p>
-      <w:pPr>
-        <w:rPr>
-          <w:rFonts w:hint="default" w:ascii="Times New Roman" w:hAnsi="Times New Roman" w:cs="Times New Roman"/>
-          <w:sz w:val="24"/>
-          <w:szCs w:val="24"/>
-          <w:lang w:val="fr-FR"/>
-        </w:rPr>
-      </w:pPr>
-    </w:p>
-    <w:p>
-      <w:pPr>
-        <w:rPr>
-          <w:rFonts w:hint="default" w:ascii="Times New Roman" w:hAnsi="Times New Roman" w:cs="Times New Roman"/>
-          <w:sz w:val="24"/>
-          <w:szCs w:val="24"/>
-          <w:lang w:val="fr-FR"/>
-        </w:rPr>
-      </w:pPr>
-    </w:p>
-    <w:p>
-      <w:pPr>
-        <w:rPr>
-          <w:rFonts w:hint="default" w:ascii="Times New Roman" w:hAnsi="Times New Roman" w:cs="Times New Roman"/>
-          <w:sz w:val="24"/>
-          <w:szCs w:val="24"/>
-          <w:lang w:val="fr-FR"/>
-        </w:rPr>
-      </w:pPr>
-    </w:p>
-    <w:p>
-      <w:pPr>
-        <w:rPr>
-          <w:rFonts w:hint="default" w:ascii="Times New Roman" w:hAnsi="Times New Roman" w:cs="Times New Roman"/>
-          <w:sz w:val="24"/>
-          <w:szCs w:val="24"/>
-          <w:lang w:val="fr-FR"/>
-        </w:rPr>
-      </w:pPr>
-    </w:p>
-    <w:p>
-      <w:pPr>
-        <w:rPr>
-          <w:rFonts w:hint="default" w:ascii="Times New Roman" w:hAnsi="Times New Roman" w:cs="Times New Roman"/>
-          <w:sz w:val="24"/>
-          <w:szCs w:val="24"/>
-          <w:lang w:val="fr-FR"/>
-        </w:rPr>
-      </w:pPr>
-    </w:p>
-    <w:p>
-      <w:pPr>
         <w:rPr>
           <w:rFonts w:hint="default" w:ascii="Times New Roman" w:hAnsi="Times New Roman" w:cs="Times New Roman"/>
           <w:sz w:val="24"/>
@@ -43226,15 +43947,6 @@
           <w:docGrid w:type="lines" w:linePitch="312" w:charSpace="0"/>
         </w:sectPr>
       </w:pPr>
-      <w:r>
-        <w:rPr>
-          <w:rFonts w:hint="default" w:ascii="Times New Roman" w:hAnsi="Times New Roman" w:cs="Times New Roman"/>
-          <w:sz w:val="24"/>
-          <w:szCs w:val="24"/>
-          <w:lang w:val="fr-FR"/>
-        </w:rPr>
-        <w:tab/>
-      </w:r>
     </w:p>
     <w:p>
       <w:pPr>
@@ -44643,7 +45355,7 @@
           <w:szCs w:val="24"/>
         </w:rPr>
         <w:pict>
-          <v:rect id="_x0000_i1042" o:spt="1" style="height:1.5pt;width:432pt;" fillcolor="#5B9BD5" filled="t" stroked="f" coordsize="21600,21600" o:hr="t" o:hrstd="t" o:hrnoshade="t" o:hralign="center">
+          <v:rect id="_x0000_i1041" o:spt="1" style="height:1.5pt;width:432pt;" fillcolor="#5B9BD5" filled="t" stroked="f" coordsize="21600,21600" o:hr="t" o:hrstd="t" o:hrnoshade="t" o:hralign="center">
             <v:path/>
             <v:fill on="t" color2="#FFFFFF" focussize="0,0"/>
             <v:stroke on="f"/>
@@ -44795,7 +45507,7 @@
         <w:bottom w:val="none" w:sz="0" w:space="0"/>
         <w:right w:val="none" w:sz="0" w:space="0"/>
       </w:pgBorders>
-      <w:pgNumType w:fmt="upperRoman" w:start="1"/>
+      <w:pgNumType w:fmt="upperRoman" w:start="12"/>
       <w:cols w:space="425" w:num="1"/>
       <w:docGrid w:type="lines" w:linePitch="312" w:charSpace="0"/>
     </w:sectPr>
@@ -44811,10 +45523,24 @@
       <w:spacing w:after="0" w:afterLines="100" w:afterAutospacing="0"/>
       <w:rPr>
         <w:rFonts w:hint="default" w:ascii="Times New Roman" w:hAnsi="Times New Roman" w:cs="Times New Roman"/>
+        <w:b w:val="0"/>
+        <w:bCs w:val="0"/>
+        <w:sz w:val="21"/>
+        <w:szCs w:val="21"/>
+        <w:lang w:val="fr-FR"/>
+      </w:rPr>
+    </w:pPr>
+  </w:p>
+  <w:p>
+    <w:pPr>
+      <w:pStyle w:val="15"/>
+      <w:spacing w:after="0" w:afterLines="100" w:afterAutospacing="0"/>
+      <w:rPr>
+        <w:rFonts w:hint="default" w:ascii="Times New Roman" w:hAnsi="Times New Roman" w:cs="Times New Roman"/>
         <w:b/>
         <w:bCs/>
-        <w:sz w:val="24"/>
-        <w:szCs w:val="24"/>
+        <w:sz w:val="21"/>
+        <w:szCs w:val="21"/>
         <w:lang w:val="fr-FR"/>
       </w:rPr>
     </w:pPr>
@@ -44823,8 +45549,8 @@
         <w:rFonts w:hint="default" w:ascii="Times New Roman" w:hAnsi="Times New Roman" w:cs="Times New Roman"/>
         <w:b w:val="0"/>
         <w:bCs w:val="0"/>
-        <w:sz w:val="24"/>
-        <w:szCs w:val="24"/>
+        <w:sz w:val="21"/>
+        <w:szCs w:val="21"/>
       </w:rPr>
       <mc:AlternateContent>
         <mc:Choice Requires="wps">
@@ -44832,12 +45558,12 @@
             <wp:anchor distT="0" distB="0" distL="114300" distR="114300" simplePos="0" relativeHeight="251660288" behindDoc="0" locked="0" layoutInCell="1" allowOverlap="1">
               <wp:simplePos x="0" y="0"/>
               <wp:positionH relativeFrom="margin">
-                <wp:posOffset>5174615</wp:posOffset>
+                <wp:posOffset>5092700</wp:posOffset>
               </wp:positionH>
               <wp:positionV relativeFrom="paragraph">
                 <wp:posOffset>0</wp:posOffset>
               </wp:positionV>
-              <wp:extent cx="243840" cy="1828800"/>
+              <wp:extent cx="181610" cy="1828800"/>
               <wp:effectExtent l="0" t="0" r="0" b="0"/>
               <wp:wrapNone/>
               <wp:docPr id="1" name="Zone de texte 1"/>
@@ -44849,7 +45575,7 @@
                     <wps:spPr>
                       <a:xfrm>
                         <a:off x="0" y="0"/>
-                        <a:ext cx="243840" cy="1828800"/>
+                        <a:ext cx="181610" cy="1828800"/>
                       </a:xfrm>
                       <a:prstGeom prst="rect">
                         <a:avLst/>
@@ -44960,7 +45686,7 @@
         </mc:Choice>
         <mc:Fallback>
           <w:pict>
-            <v:shape id="_x0000_s1026" o:spid="_x0000_s1026" o:spt="202" type="#_x0000_t202" style="position:absolute;left:0pt;margin-left:407.45pt;margin-top:0pt;height:144pt;width:19.2pt;mso-position-horizontal-relative:margin;z-index:251660288;mso-width-relative:page;mso-height-relative:page;" filled="f" stroked="f" coordsize="21600,21600" o:gfxdata="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">
+            <v:shape id="_x0000_s1026" o:spid="_x0000_s1026" o:spt="202" type="#_x0000_t202" style="position:absolute;left:0pt;margin-left:401pt;margin-top:0pt;height:144pt;width:14.3pt;mso-position-horizontal-relative:margin;z-index:251660288;mso-width-relative:page;mso-height-relative:page;" filled="f" stroked="f" coordsize="21600,21600" o:gfxdata="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">
               <v:fill on="f" focussize="0,0"/>
               <v:stroke on="f" weight="0.5pt"/>
               <v:imagedata o:title=""/>
@@ -45051,19 +45777,95 @@
         <w:rFonts w:hint="default" w:ascii="Times New Roman" w:hAnsi="Times New Roman" w:cs="Times New Roman"/>
         <w:b w:val="0"/>
         <w:bCs w:val="0"/>
-        <w:sz w:val="24"/>
-        <w:szCs w:val="24"/>
+        <w:sz w:val="21"/>
+        <w:szCs w:val="21"/>
         <w:lang w:val="fr-FR"/>
       </w:rPr>
-      <w:t xml:space="preserve">Redige et presente par  </w:t>
+      <w:t>R</w:t>
+    </w:r>
+    <w:r>
+      <w:rPr>
+        <w:rFonts w:hint="default" w:ascii="Times New Roman" w:hAnsi="Times New Roman" w:cs="Times New Roman"/>
+        <w:sz w:val="22"/>
+        <w:szCs w:val="22"/>
+      </w:rPr>
+      <w:t>é</w:t>
+    </w:r>
+    <w:r>
+      <w:rPr>
+        <w:rFonts w:hint="default" w:ascii="Times New Roman" w:hAnsi="Times New Roman" w:cs="Times New Roman"/>
+        <w:b w:val="0"/>
+        <w:bCs w:val="0"/>
+        <w:sz w:val="21"/>
+        <w:szCs w:val="21"/>
+        <w:lang w:val="fr-FR"/>
+      </w:rPr>
+      <w:t>dig</w:t>
+    </w:r>
+    <w:r>
+      <w:rPr>
+        <w:rFonts w:hint="default" w:ascii="Times New Roman" w:hAnsi="Times New Roman" w:cs="Times New Roman"/>
+        <w:sz w:val="22"/>
+        <w:szCs w:val="22"/>
+      </w:rPr>
+      <w:t>é</w:t>
+    </w:r>
+    <w:r>
+      <w:rPr>
+        <w:rFonts w:hint="default" w:ascii="Times New Roman" w:hAnsi="Times New Roman" w:cs="Times New Roman"/>
+        <w:b w:val="0"/>
+        <w:bCs w:val="0"/>
+        <w:sz w:val="21"/>
+        <w:szCs w:val="21"/>
+        <w:lang w:val="fr-FR"/>
+      </w:rPr>
+      <w:t xml:space="preserve"> et pr</w:t>
+    </w:r>
+    <w:r>
+      <w:rPr>
+        <w:rFonts w:hint="default" w:ascii="Times New Roman" w:hAnsi="Times New Roman" w:cs="Times New Roman"/>
+        <w:sz w:val="22"/>
+        <w:szCs w:val="22"/>
+      </w:rPr>
+      <w:t>é</w:t>
+    </w:r>
+    <w:r>
+      <w:rPr>
+        <w:rFonts w:hint="default" w:ascii="Times New Roman" w:hAnsi="Times New Roman" w:cs="Times New Roman"/>
+        <w:b w:val="0"/>
+        <w:bCs w:val="0"/>
+        <w:sz w:val="21"/>
+        <w:szCs w:val="21"/>
+        <w:lang w:val="fr-FR"/>
+      </w:rPr>
+      <w:t>sent</w:t>
+    </w:r>
+    <w:r>
+      <w:rPr>
+        <w:rFonts w:hint="default" w:ascii="Times New Roman" w:hAnsi="Times New Roman" w:cs="Times New Roman"/>
+        <w:sz w:val="22"/>
+        <w:szCs w:val="22"/>
+      </w:rPr>
+      <w:t>é</w:t>
+    </w:r>
+    <w:r>
+      <w:rPr>
+        <w:rFonts w:hint="default" w:ascii="Times New Roman" w:hAnsi="Times New Roman" w:cs="Times New Roman"/>
+        <w:b w:val="0"/>
+        <w:bCs w:val="0"/>
+        <w:sz w:val="21"/>
+        <w:szCs w:val="21"/>
+        <w:lang w:val="fr-FR"/>
+      </w:rPr>
+      <w:t xml:space="preserve"> par  </w:t>
     </w:r>
     <w:r>
       <w:rPr>
         <w:rFonts w:hint="default" w:ascii="Times New Roman" w:hAnsi="Times New Roman" w:cs="Times New Roman"/>
         <w:b/>
         <w:bCs/>
-        <w:sz w:val="24"/>
-        <w:szCs w:val="24"/>
+        <w:sz w:val="21"/>
+        <w:szCs w:val="21"/>
         <w:lang w:val="fr-FR"/>
       </w:rPr>
       <w:t xml:space="preserve">MESSANGA CHARLES PERIG, </w:t>
@@ -45071,13 +45873,40 @@
     <w:r>
       <w:rPr>
         <w:rFonts w:hint="default" w:ascii="Times New Roman" w:hAnsi="Times New Roman" w:cs="Times New Roman"/>
+        <w:sz w:val="22"/>
+        <w:szCs w:val="22"/>
+      </w:rPr>
+      <w:t>é</w:t>
+    </w:r>
+    <w:r>
+      <w:rPr>
+        <w:rFonts w:hint="default" w:ascii="Times New Roman" w:hAnsi="Times New Roman" w:cs="Times New Roman"/>
         <w:b w:val="0"/>
         <w:bCs w:val="0"/>
+        <w:sz w:val="21"/>
+        <w:szCs w:val="21"/>
+        <w:lang w:val="fr-FR"/>
+      </w:rPr>
+      <w:t xml:space="preserve">tudiant en fin de cycle Ingénieur </w:t>
+    </w:r>
+    <w:r>
+      <w:rPr>
+        <w:rFonts w:hint="default" w:ascii="Times New Roman" w:hAnsi="Times New Roman" w:cs="Times New Roman"/>
         <w:sz w:val="24"/>
         <w:szCs w:val="24"/>
+      </w:rPr>
+      <w:t>à</w:t>
+    </w:r>
+    <w:r>
+      <w:rPr>
+        <w:rFonts w:hint="default" w:ascii="Times New Roman" w:hAnsi="Times New Roman" w:cs="Times New Roman"/>
+        <w:b w:val="0"/>
+        <w:bCs w:val="0"/>
+        <w:sz w:val="21"/>
+        <w:szCs w:val="21"/>
         <w:lang w:val="fr-FR"/>
       </w:rPr>
-      <w:t>etudiant en fin de cycle Ingenieur a l’ENSPD, 2025/2026</w:t>
+      <w:t xml:space="preserve"> l’ENSPD, 2025/2026</w:t>
     </w:r>
   </w:p>
 </w:ftr>
@@ -45112,12 +45941,12 @@
             <wp:anchor distT="0" distB="0" distL="114300" distR="114300" simplePos="0" relativeHeight="251661312" behindDoc="0" locked="0" layoutInCell="1" allowOverlap="1">
               <wp:simplePos x="0" y="0"/>
               <wp:positionH relativeFrom="margin">
-                <wp:posOffset>5175250</wp:posOffset>
+                <wp:posOffset>5144135</wp:posOffset>
               </wp:positionH>
               <wp:positionV relativeFrom="paragraph">
-                <wp:posOffset>0</wp:posOffset>
+                <wp:posOffset>26670</wp:posOffset>
               </wp:positionV>
-              <wp:extent cx="251460" cy="175260"/>
+              <wp:extent cx="99060" cy="175260"/>
               <wp:effectExtent l="0" t="0" r="0" b="0"/>
               <wp:wrapNone/>
               <wp:docPr id="4" name="Zone de texte 4"/>
@@ -45129,7 +45958,7 @@
                     <wps:spPr>
                       <a:xfrm>
                         <a:off x="0" y="0"/>
-                        <a:ext cx="251460" cy="175260"/>
+                        <a:ext cx="99060" cy="175260"/>
                       </a:xfrm>
                       <a:prstGeom prst="rect">
                         <a:avLst/>
@@ -45240,7 +46069,7 @@
         </mc:Choice>
         <mc:Fallback>
           <w:pict>
-            <v:shape id="_x0000_s1026" o:spid="_x0000_s1026" o:spt="202" type="#_x0000_t202" style="position:absolute;left:0pt;margin-left:407.5pt;margin-top:0pt;height:13.8pt;width:19.8pt;mso-position-horizontal-relative:margin;z-index:251661312;mso-width-relative:page;mso-height-relative:page;" filled="f" stroked="f" coordsize="21600,21600" o:gfxdata="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">
+            <v:shape id="_x0000_s1026" o:spid="_x0000_s1026" o:spt="202" type="#_x0000_t202" style="position:absolute;left:0pt;margin-left:405.05pt;margin-top:2.1pt;height:13.8pt;width:7.8pt;mso-position-horizontal-relative:margin;z-index:251661312;mso-width-relative:page;mso-height-relative:page;" filled="f" stroked="f" coordsize="21600,21600" o:gfxdata="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">
               <v:fill on="f" focussize="0,0"/>
               <v:stroke on="f" weight="0.5pt"/>
               <v:imagedata o:title=""/>
@@ -45525,8 +46354,8 @@
         <w:rFonts w:hint="default" w:ascii="Times New Roman" w:hAnsi="Times New Roman" w:cs="Times New Roman"/>
         <w:b/>
         <w:bCs/>
-        <w:sz w:val="24"/>
-        <w:szCs w:val="24"/>
+        <w:sz w:val="21"/>
+        <w:szCs w:val="21"/>
         <w:lang w:val="fr-FR"/>
       </w:rPr>
     </w:pPr>
@@ -45535,24 +46364,24 @@
         <w:rFonts w:hint="default" w:ascii="Times New Roman" w:hAnsi="Times New Roman" w:cs="Times New Roman"/>
         <w:b w:val="0"/>
         <w:bCs w:val="0"/>
-        <w:sz w:val="24"/>
-        <w:szCs w:val="24"/>
+        <w:sz w:val="21"/>
+        <w:szCs w:val="21"/>
       </w:rPr>
       <mc:AlternateContent>
         <mc:Choice Requires="wps">
           <w:drawing>
-            <wp:anchor distT="0" distB="0" distL="114300" distR="114300" simplePos="0" relativeHeight="251665408" behindDoc="0" locked="0" layoutInCell="1" allowOverlap="1">
+            <wp:anchor distT="0" distB="0" distL="114300" distR="114300" simplePos="0" relativeHeight="251664384" behindDoc="0" locked="0" layoutInCell="1" allowOverlap="1">
               <wp:simplePos x="0" y="0"/>
               <wp:positionH relativeFrom="margin">
-                <wp:posOffset>5191125</wp:posOffset>
+                <wp:posOffset>5092700</wp:posOffset>
               </wp:positionH>
               <wp:positionV relativeFrom="paragraph">
-                <wp:posOffset>-7620</wp:posOffset>
+                <wp:posOffset>0</wp:posOffset>
               </wp:positionV>
-              <wp:extent cx="319405" cy="175260"/>
+              <wp:extent cx="181610" cy="1828800"/>
               <wp:effectExtent l="0" t="0" r="0" b="0"/>
               <wp:wrapNone/>
-              <wp:docPr id="11" name="Zone de texte 11"/>
+              <wp:docPr id="39" name="Zone de texte 39"/>
               <wp:cNvGraphicFramePr/>
               <a:graphic xmlns:a="http://schemas.openxmlformats.org/drawingml/2006/main">
                 <a:graphicData uri="http://schemas.microsoft.com/office/word/2010/wordprocessingShape">
@@ -45561,7 +46390,7 @@
                     <wps:spPr>
                       <a:xfrm>
                         <a:off x="0" y="0"/>
-                        <a:ext cx="319405" cy="175260"/>
+                        <a:ext cx="181610" cy="1828800"/>
                       </a:xfrm>
                       <a:prstGeom prst="rect">
                         <a:avLst/>
@@ -45594,7 +46423,28 @@
                               <w:rFonts w:hint="default" w:ascii="Times New Roman" w:hAnsi="Times New Roman" w:cs="Times New Roman"/>
                               <w:b/>
                               <w:bCs/>
-                              <w:lang w:val="fr-FR"/>
+                              <w:color w:val="auto"/>
+                              <w14:textFill>
+                                <w14:gradFill>
+                                  <w14:gsLst>
+                                    <w14:gs w14:pos="50000">
+                                      <w14:schemeClr w14:val="tx1"/>
+                                    </w14:gs>
+                                    <w14:gs w14:pos="0">
+                                      <w14:schemeClr w14:val="tx1">
+                                        <w14:lumMod w14:val="25000"/>
+                                        <w14:lumOff w14:val="75000"/>
+                                      </w14:schemeClr>
+                                    </w14:gs>
+                                    <w14:gs w14:pos="100000">
+                                      <w14:schemeClr w14:val="tx1">
+                                        <w14:lumMod w14:val="85000"/>
+                                      </w14:schemeClr>
+                                    </w14:gs>
+                                  </w14:gsLst>
+                                  <w14:lin w14:ang="5400000" w14:scaled="1"/>
+                                </w14:gradFill>
+                              </w14:textFill>
                             </w:rPr>
                           </w:pPr>
                           <w:r>
@@ -45602,26 +46452,46 @@
                               <w:rFonts w:hint="default" w:ascii="Times New Roman" w:hAnsi="Times New Roman" w:cs="Times New Roman"/>
                               <w:b/>
                               <w:bCs/>
-                              <w:lang w:val="fr-FR"/>
                             </w:rPr>
-                            <w:t>X11</w:t>
+                            <w:fldChar w:fldCharType="begin"/>
                           </w:r>
-                        </w:p>
-                        <w:p>
-                          <w:pPr>
-                            <w:pStyle w:val="15"/>
+                          <w:r>
                             <w:rPr>
                               <w:rFonts w:hint="default" w:ascii="Times New Roman" w:hAnsi="Times New Roman" w:cs="Times New Roman"/>
                               <w:b/>
                               <w:bCs/>
-                              <w:lang w:val="fr-FR"/>
                             </w:rPr>
-                          </w:pPr>
+                            <w:instrText xml:space="preserve"> PAGE  \* MERGEFORMAT </w:instrText>
+                          </w:r>
+                          <w:r>
+                            <w:rPr>
+                              <w:rFonts w:hint="default" w:ascii="Times New Roman" w:hAnsi="Times New Roman" w:cs="Times New Roman"/>
+                              <w:b/>
+                              <w:bCs/>
+                            </w:rPr>
+                            <w:fldChar w:fldCharType="separate"/>
+                          </w:r>
+                          <w:r>
+                            <w:rPr>
+                              <w:rFonts w:hint="default" w:ascii="Times New Roman" w:hAnsi="Times New Roman" w:cs="Times New Roman"/>
+                              <w:b/>
+                              <w:bCs/>
+                            </w:rPr>
+                            <w:t>1</w:t>
+                          </w:r>
+                          <w:r>
+                            <w:rPr>
+                              <w:rFonts w:hint="default" w:ascii="Times New Roman" w:hAnsi="Times New Roman" w:cs="Times New Roman"/>
+                              <w:b/>
+                              <w:bCs/>
+                            </w:rPr>
+                            <w:fldChar w:fldCharType="end"/>
+                          </w:r>
                         </w:p>
                       </w:txbxContent>
                     </wps:txbx>
                     <wps:bodyPr rot="0" spcFirstLastPara="0" vertOverflow="overflow" horzOverflow="overflow" vert="horz" wrap="square" lIns="0" tIns="0" rIns="0" bIns="0" numCol="1" spcCol="0" rtlCol="0" fromWordArt="0" anchor="t" anchorCtr="0" forceAA="0" upright="0" compatLnSpc="1">
-                      <a:noAutofit/>
+                      <a:spAutoFit/>
                     </wps:bodyPr>
                   </wps:wsp>
                 </a:graphicData>
@@ -45631,12 +46501,12 @@
         </mc:Choice>
         <mc:Fallback>
           <w:pict>
-            <v:shape id="_x0000_s1026" o:spid="_x0000_s1026" o:spt="202" type="#_x0000_t202" style="position:absolute;left:0pt;margin-left:408.75pt;margin-top:-0.6pt;height:13.8pt;width:25.15pt;mso-position-horizontal-relative:margin;z-index:251665408;mso-width-relative:page;mso-height-relative:page;" filled="f" stroked="f" coordsize="21600,21600" o:gfxdata="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">
+            <v:shape id="_x0000_s1026" o:spid="_x0000_s1026" o:spt="202" type="#_x0000_t202" style="position:absolute;left:0pt;margin-left:401pt;margin-top:0pt;height:144pt;width:14.3pt;mso-position-horizontal-relative:margin;z-index:251664384;mso-width-relative:page;mso-height-relative:page;" filled="f" stroked="f" coordsize="21600,21600" o:gfxdata="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">
               <v:fill on="f" focussize="0,0"/>
               <v:stroke on="f" weight="0.5pt"/>
               <v:imagedata o:title=""/>
               <o:lock v:ext="edit" aspectratio="f"/>
-              <v:textbox inset="0mm,0mm,0mm,0mm">
+              <v:textbox inset="0mm,0mm,0mm,0mm" style="mso-fit-shape-to-text:t;">
                 <w:txbxContent>
                   <w:p>
                     <w:pPr>
@@ -45645,7 +46515,28 @@
                         <w:rFonts w:hint="default" w:ascii="Times New Roman" w:hAnsi="Times New Roman" w:cs="Times New Roman"/>
                         <w:b/>
                         <w:bCs/>
-                        <w:lang w:val="fr-FR"/>
+                        <w:color w:val="auto"/>
+                        <w14:textFill>
+                          <w14:gradFill>
+                            <w14:gsLst>
+                              <w14:gs w14:pos="50000">
+                                <w14:schemeClr w14:val="tx1"/>
+                              </w14:gs>
+                              <w14:gs w14:pos="0">
+                                <w14:schemeClr w14:val="tx1">
+                                  <w14:lumMod w14:val="25000"/>
+                                  <w14:lumOff w14:val="75000"/>
+                                </w14:schemeClr>
+                              </w14:gs>
+                              <w14:gs w14:pos="100000">
+                                <w14:schemeClr w14:val="tx1">
+                                  <w14:lumMod w14:val="85000"/>
+                                </w14:schemeClr>
+                              </w14:gs>
+                            </w14:gsLst>
+                            <w14:lin w14:ang="5400000" w14:scaled="1"/>
+                          </w14:gradFill>
+                        </w14:textFill>
                       </w:rPr>
                     </w:pPr>
                     <w:r>
@@ -45653,21 +46544,41 @@
                         <w:rFonts w:hint="default" w:ascii="Times New Roman" w:hAnsi="Times New Roman" w:cs="Times New Roman"/>
                         <w:b/>
                         <w:bCs/>
-                        <w:lang w:val="fr-FR"/>
                       </w:rPr>
-                      <w:t>X11</w:t>
+                      <w:fldChar w:fldCharType="begin"/>
                     </w:r>
-                  </w:p>
-                  <w:p>
-                    <w:pPr>
-                      <w:pStyle w:val="15"/>
+                    <w:r>
                       <w:rPr>
                         <w:rFonts w:hint="default" w:ascii="Times New Roman" w:hAnsi="Times New Roman" w:cs="Times New Roman"/>
                         <w:b/>
                         <w:bCs/>
-                        <w:lang w:val="fr-FR"/>
                       </w:rPr>
-                    </w:pPr>
+                      <w:instrText xml:space="preserve"> PAGE  \* MERGEFORMAT </w:instrText>
+                    </w:r>
+                    <w:r>
+                      <w:rPr>
+                        <w:rFonts w:hint="default" w:ascii="Times New Roman" w:hAnsi="Times New Roman" w:cs="Times New Roman"/>
+                        <w:b/>
+                        <w:bCs/>
+                      </w:rPr>
+                      <w:fldChar w:fldCharType="separate"/>
+                    </w:r>
+                    <w:r>
+                      <w:rPr>
+                        <w:rFonts w:hint="default" w:ascii="Times New Roman" w:hAnsi="Times New Roman" w:cs="Times New Roman"/>
+                        <w:b/>
+                        <w:bCs/>
+                      </w:rPr>
+                      <w:t>1</w:t>
+                    </w:r>
+                    <w:r>
+                      <w:rPr>
+                        <w:rFonts w:hint="default" w:ascii="Times New Roman" w:hAnsi="Times New Roman" w:cs="Times New Roman"/>
+                        <w:b/>
+                        <w:bCs/>
+                      </w:rPr>
+                      <w:fldChar w:fldCharType="end"/>
+                    </w:r>
                   </w:p>
                 </w:txbxContent>
               </v:textbox>
@@ -45681,19 +46592,95 @@
         <w:rFonts w:hint="default" w:ascii="Times New Roman" w:hAnsi="Times New Roman" w:cs="Times New Roman"/>
         <w:b w:val="0"/>
         <w:bCs w:val="0"/>
-        <w:sz w:val="24"/>
-        <w:szCs w:val="24"/>
+        <w:sz w:val="21"/>
+        <w:szCs w:val="21"/>
         <w:lang w:val="fr-FR"/>
       </w:rPr>
-      <w:t xml:space="preserve">Redige et presente par  </w:t>
+      <w:t>R</w:t>
+    </w:r>
+    <w:r>
+      <w:rPr>
+        <w:rFonts w:hint="default" w:ascii="Times New Roman" w:hAnsi="Times New Roman" w:cs="Times New Roman"/>
+        <w:sz w:val="22"/>
+        <w:szCs w:val="22"/>
+      </w:rPr>
+      <w:t>é</w:t>
+    </w:r>
+    <w:r>
+      <w:rPr>
+        <w:rFonts w:hint="default" w:ascii="Times New Roman" w:hAnsi="Times New Roman" w:cs="Times New Roman"/>
+        <w:b w:val="0"/>
+        <w:bCs w:val="0"/>
+        <w:sz w:val="21"/>
+        <w:szCs w:val="21"/>
+        <w:lang w:val="fr-FR"/>
+      </w:rPr>
+      <w:t>dig</w:t>
+    </w:r>
+    <w:r>
+      <w:rPr>
+        <w:rFonts w:hint="default" w:ascii="Times New Roman" w:hAnsi="Times New Roman" w:cs="Times New Roman"/>
+        <w:sz w:val="22"/>
+        <w:szCs w:val="22"/>
+      </w:rPr>
+      <w:t>é</w:t>
+    </w:r>
+    <w:r>
+      <w:rPr>
+        <w:rFonts w:hint="default" w:ascii="Times New Roman" w:hAnsi="Times New Roman" w:cs="Times New Roman"/>
+        <w:b w:val="0"/>
+        <w:bCs w:val="0"/>
+        <w:sz w:val="21"/>
+        <w:szCs w:val="21"/>
+        <w:lang w:val="fr-FR"/>
+      </w:rPr>
+      <w:t xml:space="preserve"> et pr</w:t>
+    </w:r>
+    <w:r>
+      <w:rPr>
+        <w:rFonts w:hint="default" w:ascii="Times New Roman" w:hAnsi="Times New Roman" w:cs="Times New Roman"/>
+        <w:sz w:val="22"/>
+        <w:szCs w:val="22"/>
+      </w:rPr>
+      <w:t>é</w:t>
+    </w:r>
+    <w:r>
+      <w:rPr>
+        <w:rFonts w:hint="default" w:ascii="Times New Roman" w:hAnsi="Times New Roman" w:cs="Times New Roman"/>
+        <w:b w:val="0"/>
+        <w:bCs w:val="0"/>
+        <w:sz w:val="21"/>
+        <w:szCs w:val="21"/>
+        <w:lang w:val="fr-FR"/>
+      </w:rPr>
+      <w:t>sent</w:t>
+    </w:r>
+    <w:r>
+      <w:rPr>
+        <w:rFonts w:hint="default" w:ascii="Times New Roman" w:hAnsi="Times New Roman" w:cs="Times New Roman"/>
+        <w:sz w:val="22"/>
+        <w:szCs w:val="22"/>
+      </w:rPr>
+      <w:t>é</w:t>
+    </w:r>
+    <w:r>
+      <w:rPr>
+        <w:rFonts w:hint="default" w:ascii="Times New Roman" w:hAnsi="Times New Roman" w:cs="Times New Roman"/>
+        <w:b w:val="0"/>
+        <w:bCs w:val="0"/>
+        <w:sz w:val="21"/>
+        <w:szCs w:val="21"/>
+        <w:lang w:val="fr-FR"/>
+      </w:rPr>
+      <w:t xml:space="preserve"> par  </w:t>
     </w:r>
     <w:r>
       <w:rPr>
         <w:rFonts w:hint="default" w:ascii="Times New Roman" w:hAnsi="Times New Roman" w:cs="Times New Roman"/>
         <w:b/>
         <w:bCs/>
-        <w:sz w:val="24"/>
-        <w:szCs w:val="24"/>
+        <w:sz w:val="21"/>
+        <w:szCs w:val="21"/>
         <w:lang w:val="fr-FR"/>
       </w:rPr>
       <w:t xml:space="preserve">MESSANGA CHARLES PERIG, </w:t>
@@ -45701,13 +46688,40 @@
     <w:r>
       <w:rPr>
         <w:rFonts w:hint="default" w:ascii="Times New Roman" w:hAnsi="Times New Roman" w:cs="Times New Roman"/>
+        <w:sz w:val="22"/>
+        <w:szCs w:val="22"/>
+      </w:rPr>
+      <w:t>é</w:t>
+    </w:r>
+    <w:r>
+      <w:rPr>
+        <w:rFonts w:hint="default" w:ascii="Times New Roman" w:hAnsi="Times New Roman" w:cs="Times New Roman"/>
         <w:b w:val="0"/>
         <w:bCs w:val="0"/>
+        <w:sz w:val="21"/>
+        <w:szCs w:val="21"/>
+        <w:lang w:val="fr-FR"/>
+      </w:rPr>
+      <w:t xml:space="preserve">tudiant en fin de cycle Ingénieur </w:t>
+    </w:r>
+    <w:r>
+      <w:rPr>
+        <w:rFonts w:hint="default" w:ascii="Times New Roman" w:hAnsi="Times New Roman" w:cs="Times New Roman"/>
         <w:sz w:val="24"/>
         <w:szCs w:val="24"/>
+      </w:rPr>
+      <w:t>à</w:t>
+    </w:r>
+    <w:r>
+      <w:rPr>
+        <w:rFonts w:hint="default" w:ascii="Times New Roman" w:hAnsi="Times New Roman" w:cs="Times New Roman"/>
+        <w:b w:val="0"/>
+        <w:bCs w:val="0"/>
+        <w:sz w:val="21"/>
+        <w:szCs w:val="21"/>
         <w:lang w:val="fr-FR"/>
       </w:rPr>
-      <w:t>etudiant en fin de cycle Ingenieur a l’ENSPD, 2025/2026</w:t>
+      <w:t xml:space="preserve"> l’ENSPD, 2025/2026</w:t>
     </w:r>
   </w:p>
   <w:p>

</xml_diff>

<commit_message>
Déploiement Automatisé : GitHub Actions + Base Path
</commit_message>
<xml_diff>
--- a/rapport de stage academique.docx
+++ b/rapport de stage academique.docx
@@ -11426,7 +11426,7 @@
           <w:szCs w:val="36"/>
           <w:lang w:val="fr-FR"/>
         </w:rPr>
-        <w:t xml:space="preserve">CHAPITRE 2: METHODE ET OUTILS DE DEVLOPPEMENT </w:t>
+        <w:t xml:space="preserve">CHAPITRE 2: METHODE ET OUTILS DE DEVELOPPEMENT </w:t>
       </w:r>
     </w:p>
     <w:p>
@@ -43726,8 +43726,6 @@
           <w:lang w:val="fr-FR"/>
         </w:rPr>
       </w:pPr>
-      <w:bookmarkStart w:id="0" w:name="_GoBack"/>
-      <w:bookmarkEnd w:id="0"/>
     </w:p>
     <w:p>
       <w:pPr>
@@ -44931,6 +44929,8 @@
         </w:rPr>
         <w:t xml:space="preserve">TABLES DE MATIERES </w:t>
       </w:r>
+      <w:bookmarkStart w:id="0" w:name="_GoBack"/>
+      <w:bookmarkEnd w:id="0"/>
     </w:p>
     <w:p>
       <w:pPr>
@@ -52417,7 +52417,7 @@
     <w:lsdException w:qFormat="1" w:unhideWhenUsed="0" w:uiPriority="0" w:semiHidden="0" w:name="HTML Code"/>
     <w:lsdException w:unhideWhenUsed="0" w:uiPriority="0" w:semiHidden="0" w:name="HTML Definition"/>
     <w:lsdException w:unhideWhenUsed="0" w:uiPriority="0" w:semiHidden="0" w:name="HTML Keyboard"/>
-    <w:lsdException w:unhideWhenUsed="0" w:uiPriority="0" w:semiHidden="0" w:name="HTML Preformatted"/>
+    <w:lsdException w:qFormat="1" w:unhideWhenUsed="0" w:uiPriority="0" w:semiHidden="0" w:name="HTML Preformatted"/>
     <w:lsdException w:unhideWhenUsed="0" w:uiPriority="0" w:semiHidden="0" w:name="HTML Sample"/>
     <w:lsdException w:unhideWhenUsed="0" w:uiPriority="0" w:semiHidden="0" w:name="HTML Typewriter"/>
     <w:lsdException w:unhideWhenUsed="0" w:uiPriority="0" w:semiHidden="0" w:name="HTML Variable"/>
@@ -52601,6 +52601,7 @@
   </w:style>
   <w:style w:type="paragraph" w:styleId="12">
     <w:name w:val="HTML Preformatted"/>
+    <w:qFormat/>
     <w:uiPriority w:val="0"/>
     <w:pPr>
       <w:tabs>

</xml_diff>